<commit_message>
Mostrando ejemplos de actualización en git
</commit_message>
<xml_diff>
--- a/0) Syllabus/Sem 5 - Sistemas Digitales - Presencial - 10 Sem.docx
+++ b/0) Syllabus/Sem 5 - Sistemas Digitales - Presencial - 10 Sem.docx
@@ -1,6 +1,6 @@
 
 <file path=word/document.xml><?xml version="1.0" encoding="utf-8"?>
-<w:document xmlns:wpc="http://schemas.microsoft.com/office/word/2010/wordprocessingCanvas" xmlns:cx="http://schemas.microsoft.com/office/drawing/2014/chartex" xmlns:cx1="http://schemas.microsoft.com/office/drawing/2015/9/8/chartex" xmlns:cx2="http://schemas.microsoft.com/office/drawing/2015/10/21/chartex" xmlns:cx3="http://schemas.microsoft.com/office/drawing/2016/5/9/chartex" xmlns:cx4="http://schemas.microsoft.com/office/drawing/2016/5/10/chartex" xmlns:cx5="http://schemas.microsoft.com/office/drawing/2016/5/11/chartex" xmlns:cx6="http://schemas.microsoft.com/office/drawing/2016/5/12/chartex" xmlns:cx7="http://schemas.microsoft.com/office/drawing/2016/5/13/chartex" xmlns:cx8="http://schemas.microsoft.com/office/drawing/2016/5/14/chartex" xmlns:mc="http://schemas.openxmlformats.org/markup-compatibility/2006" xmlns:aink="http://schemas.microsoft.com/office/drawing/2016/ink" xmlns:am3d="http://schemas.microsoft.com/office/drawing/2017/model3d" xmlns:o="urn:schemas-microsoft-com:office:office" xmlns:oel="http://schemas.microsoft.com/office/2019/extlst" xmlns:r="http://schemas.openxmlformats.org/officeDocument/2006/relationships" xmlns:m="http://schemas.openxmlformats.org/officeDocument/2006/math" xmlns:v="urn:schemas-microsoft-com:vml" xmlns:wp14="http://schemas.microsoft.com/office/word/2010/wordprocessingDrawing" xmlns:wp="http://schemas.openxmlformats.org/drawingml/2006/wordprocessingDrawing" xmlns:w10="urn:schemas-microsoft-com:office:word" xmlns:w="http://schemas.openxmlformats.org/wordprocessingml/2006/main" xmlns:w14="http://schemas.microsoft.com/office/word/2010/wordml" xmlns:w15="http://schemas.microsoft.com/office/word/2012/wordml" xmlns:w16cex="http://schemas.microsoft.com/office/word/2018/wordml/cex" xmlns:w16cid="http://schemas.microsoft.com/office/word/2016/wordml/cid" xmlns:w16="http://schemas.microsoft.com/office/word/2018/wordml" xmlns:w16du="http://schemas.microsoft.com/office/word/2023/wordml/word16du" xmlns:w16sdtdh="http://schemas.microsoft.com/office/word/2020/wordml/sdtdatahash" xmlns:w16sdtfl="http://schemas.microsoft.com/office/word/2024/wordml/sdtformatlock" xmlns:w16se="http://schemas.microsoft.com/office/word/2015/wordml/symex" xmlns:wpg="http://schemas.microsoft.com/office/word/2010/wordprocessingGroup" xmlns:wpi="http://schemas.microsoft.com/office/word/2010/wordprocessingInk" xmlns:wne="http://schemas.microsoft.com/office/word/2006/wordml" xmlns:wps="http://schemas.microsoft.com/office/word/2010/wordprocessingShape" mc:Ignorable="w14 w15 w16se w16cid w16 w16cex w16sdtdh w16sdtfl w16du wp14">
+<w:document xmlns:wpc="http://schemas.microsoft.com/office/word/2010/wordprocessingCanvas" xmlns:cx="http://schemas.microsoft.com/office/drawing/2014/chartex" xmlns:mc="http://schemas.openxmlformats.org/markup-compatibility/2006" xmlns:o="urn:schemas-microsoft-com:office:office" xmlns:r="http://schemas.openxmlformats.org/officeDocument/2006/relationships" xmlns:m="http://schemas.openxmlformats.org/officeDocument/2006/math" xmlns:v="urn:schemas-microsoft-com:vml" xmlns:wp14="http://schemas.microsoft.com/office/word/2010/wordprocessingDrawing" xmlns:wp="http://schemas.openxmlformats.org/drawingml/2006/wordprocessingDrawing" xmlns:w10="urn:schemas-microsoft-com:office:word" xmlns:w="http://schemas.openxmlformats.org/wordprocessingml/2006/main" xmlns:w14="http://schemas.microsoft.com/office/word/2010/wordml" xmlns:w15="http://schemas.microsoft.com/office/word/2012/wordml" xmlns:w16se="http://schemas.microsoft.com/office/word/2015/wordml/symex" xmlns:wpg="http://schemas.microsoft.com/office/word/2010/wordprocessingGroup" xmlns:wpi="http://schemas.microsoft.com/office/word/2010/wordprocessingInk" xmlns:wne="http://schemas.microsoft.com/office/word/2006/wordml" xmlns:wps="http://schemas.microsoft.com/office/word/2010/wordprocessingShape" mc:Ignorable="w14 w15 w16se wp14">
   <w:body>
     <w:p>
       <w:pPr>
@@ -9,6 +9,7 @@
       <w:r>
         <w:rPr>
           <w:noProof/>
+          <w:lang w:eastAsia="es-CO"/>
         </w:rPr>
         <w:drawing>
           <wp:anchor distT="0" distB="0" distL="114300" distR="114300" simplePos="0" relativeHeight="251658240" behindDoc="0" locked="0" layoutInCell="1" allowOverlap="1" wp14:anchorId="2B5F4862" wp14:editId="28835BE2">
@@ -81,6 +82,7 @@
       <w:r>
         <w:rPr>
           <w:noProof/>
+          <w:lang w:eastAsia="es-CO"/>
         </w:rPr>
         <w:drawing>
           <wp:anchor distT="0" distB="0" distL="114300" distR="114300" simplePos="0" relativeHeight="251658245" behindDoc="0" locked="0" layoutInCell="1" allowOverlap="1" wp14:anchorId="2C536458" wp14:editId="40703500">
@@ -106,13 +108,13 @@
                     <pic:cNvPicPr/>
                   </pic:nvPicPr>
                   <pic:blipFill>
-                    <a:blip r:embed="rId11">
+                    <a:blip r:embed="rId11" cstate="print">
                       <a:extLst>
                         <a:ext uri="{28A0092B-C50C-407E-A947-70E740481C1C}">
                           <a14:useLocalDpi xmlns:a14="http://schemas.microsoft.com/office/drawing/2010/main" val="0"/>
                         </a:ext>
                         <a:ext uri="{96DAC541-7B7A-43D3-8B79-37D633B846F1}">
-                          <asvg:svgBlip xmlns:asvg="http://schemas.microsoft.com/office/drawing/2016/SVG/main" r:embed="rId12"/>
+                          <asvg:svgBlip xmlns:asvg="http://schemas.microsoft.com/office/drawing/2016/SVG/main" xmlns:w16sdtfl="http://schemas.microsoft.com/office/word/2024/wordml/sdtformatlock" xmlns:w16sdtdh="http://schemas.microsoft.com/office/word/2020/wordml/sdtdatahash" xmlns:w16du="http://schemas.microsoft.com/office/word/2023/wordml/word16du" xmlns:w16="http://schemas.microsoft.com/office/word/2018/wordml" xmlns:w16cid="http://schemas.microsoft.com/office/word/2016/wordml/cid" xmlns:w16cex="http://schemas.microsoft.com/office/word/2018/wordml/cex" xmlns:w="http://schemas.openxmlformats.org/wordprocessingml/2006/main" xmlns:w10="urn:schemas-microsoft-com:office:word" xmlns:v="urn:schemas-microsoft-com:vml" xmlns:oel="http://schemas.microsoft.com/office/2019/extlst" xmlns:o="urn:schemas-microsoft-com:office:office" xmlns:am3d="http://schemas.microsoft.com/office/drawing/2017/model3d" xmlns:aink="http://schemas.microsoft.com/office/drawing/2016/ink" xmlns:cx8="http://schemas.microsoft.com/office/drawing/2016/5/14/chartex" xmlns:cx7="http://schemas.microsoft.com/office/drawing/2016/5/13/chartex" xmlns:cx6="http://schemas.microsoft.com/office/drawing/2016/5/12/chartex" xmlns:cx5="http://schemas.microsoft.com/office/drawing/2016/5/11/chartex" xmlns:cx4="http://schemas.microsoft.com/office/drawing/2016/5/10/chartex" xmlns:cx3="http://schemas.microsoft.com/office/drawing/2016/5/9/chartex" xmlns:cx2="http://schemas.microsoft.com/office/drawing/2015/10/21/chartex" xmlns:cx1="http://schemas.microsoft.com/office/drawing/2015/9/8/chartex" xmlns="" r:embed="rId12"/>
                         </a:ext>
                       </a:extLst>
                     </a:blip>
@@ -144,6 +146,7 @@
       <w:r>
         <w:rPr>
           <w:noProof/>
+          <w:lang w:eastAsia="es-CO"/>
         </w:rPr>
         <mc:AlternateContent>
           <mc:Choice Requires="wps">
@@ -208,7 +211,7 @@
                               </w:rPr>
                               <w:t>U</w:t>
                             </w:r>
-                            <w:del w:id="0" w:author="Ing Angelo Rodriguez" w:date="2025-07-17T14:33:00Z" w16du:dateUtc="2025-07-17T19:33:00Z">
+                            <w:del w:id="0" w:author="Ing Angelo Rodriguez" w:date="2025-07-17T14:33:00Z">
                               <w:r>
                                 <w:rPr>
                                   <w:rFonts w:ascii="Roboto" w:hAnsi="Roboto" w:cstheme="minorHAnsi"/>
@@ -234,7 +237,7 @@
                               </w:rPr>
                               <w:t>Compensa</w:t>
                             </w:r>
-                            <w:ins w:id="1" w:author="Ing Angelo Rodriguez" w:date="2025-07-17T14:33:00Z" w16du:dateUtc="2025-07-17T19:33:00Z">
+                            <w:ins w:id="1" w:author="Ing Angelo Rodriguez" w:date="2025-07-17T14:33:00Z">
                               <w:r>
                                 <w:rPr>
                                   <w:rFonts w:ascii="Roboto" w:hAnsi="Roboto" w:cstheme="minorHAnsi"/>
@@ -249,7 +252,7 @@
                               </w:r>
                             </w:ins>
                             <w:proofErr w:type="spellEnd"/>
-                            <w:del w:id="2" w:author="Ing Angelo Rodriguez" w:date="2025-07-17T14:33:00Z" w16du:dateUtc="2025-07-17T19:33:00Z">
+                            <w:del w:id="2" w:author="Ing Angelo Rodriguez" w:date="2025-07-17T14:33:00Z">
                               <w:r>
                                 <w:rPr>
                                   <w:rFonts w:ascii="Roboto" w:hAnsi="Roboto" w:cstheme="minorHAnsi"/>
@@ -317,7 +320,7 @@
               </wp:anchor>
             </w:drawing>
           </mc:Choice>
-          <mc:Fallback>
+          <mc:Fallback xmlns:w16sdtfl="http://schemas.microsoft.com/office/word/2024/wordml/sdtformatlock" xmlns:w16sdtdh="http://schemas.microsoft.com/office/word/2020/wordml/sdtdatahash" xmlns:w16du="http://schemas.microsoft.com/office/word/2023/wordml/word16du" xmlns:w16="http://schemas.microsoft.com/office/word/2018/wordml" xmlns:w16cid="http://schemas.microsoft.com/office/word/2016/wordml/cid" xmlns:w16cex="http://schemas.microsoft.com/office/word/2018/wordml/cex" xmlns:oel="http://schemas.microsoft.com/office/2019/extlst" xmlns:am3d="http://schemas.microsoft.com/office/drawing/2017/model3d" xmlns:aink="http://schemas.microsoft.com/office/drawing/2016/ink" xmlns:cx8="http://schemas.microsoft.com/office/drawing/2016/5/14/chartex" xmlns:cx7="http://schemas.microsoft.com/office/drawing/2016/5/13/chartex" xmlns:cx6="http://schemas.microsoft.com/office/drawing/2016/5/12/chartex" xmlns:cx5="http://schemas.microsoft.com/office/drawing/2016/5/11/chartex" xmlns:cx4="http://schemas.microsoft.com/office/drawing/2016/5/10/chartex" xmlns:cx3="http://schemas.microsoft.com/office/drawing/2016/5/9/chartex" xmlns:cx2="http://schemas.microsoft.com/office/drawing/2015/10/21/chartex" xmlns:cx1="http://schemas.microsoft.com/office/drawing/2015/9/8/chartex">
             <w:pict>
               <v:shapetype w14:anchorId="304F904A" id="_x0000_t202" coordsize="21600,21600" o:spt="202" path="m,l,21600r21600,l21600,xe">
                 <v:stroke joinstyle="miter"/>
@@ -460,6 +463,7 @@
       <w:r>
         <w:rPr>
           <w:noProof/>
+          <w:lang w:eastAsia="es-CO"/>
         </w:rPr>
         <mc:AlternateContent>
           <mc:Choice Requires="wps">
@@ -516,7 +520,7 @@
               </wp:anchor>
             </w:drawing>
           </mc:Choice>
-          <mc:Fallback xmlns:arto="http://schemas.microsoft.com/office/word/2006/arto" xmlns:asvg="http://schemas.microsoft.com/office/drawing/2016/SVG/main" xmlns:a14="http://schemas.microsoft.com/office/drawing/2010/main" xmlns:pic="http://schemas.openxmlformats.org/drawingml/2006/picture" xmlns:a="http://schemas.openxmlformats.org/drawingml/2006/main" xmlns:dgm="http://schemas.openxmlformats.org/drawingml/2006/diagram" xmlns:a16="http://schemas.microsoft.com/office/drawing/2014/main">
+          <mc:Fallback xmlns:a16="http://schemas.microsoft.com/office/drawing/2014/main" xmlns:dgm="http://schemas.openxmlformats.org/drawingml/2006/diagram" xmlns:a="http://schemas.openxmlformats.org/drawingml/2006/main" xmlns:pic="http://schemas.openxmlformats.org/drawingml/2006/picture" xmlns:a14="http://schemas.microsoft.com/office/drawing/2010/main" xmlns:asvg="http://schemas.microsoft.com/office/drawing/2016/SVG/main" xmlns:arto="http://schemas.microsoft.com/office/word/2006/arto" xmlns:w16sdtfl="http://schemas.microsoft.com/office/word/2024/wordml/sdtformatlock" xmlns:w16sdtdh="http://schemas.microsoft.com/office/word/2020/wordml/sdtdatahash" xmlns:w16du="http://schemas.microsoft.com/office/word/2023/wordml/word16du" xmlns:w16="http://schemas.microsoft.com/office/word/2018/wordml" xmlns:w16cid="http://schemas.microsoft.com/office/word/2016/wordml/cid" xmlns:w16cex="http://schemas.microsoft.com/office/word/2018/wordml/cex" xmlns:oel="http://schemas.microsoft.com/office/2019/extlst" xmlns:am3d="http://schemas.microsoft.com/office/drawing/2017/model3d" xmlns:aink="http://schemas.microsoft.com/office/drawing/2016/ink" xmlns:cx8="http://schemas.microsoft.com/office/drawing/2016/5/14/chartex" xmlns:cx7="http://schemas.microsoft.com/office/drawing/2016/5/13/chartex" xmlns:cx6="http://schemas.microsoft.com/office/drawing/2016/5/12/chartex" xmlns:cx5="http://schemas.microsoft.com/office/drawing/2016/5/11/chartex" xmlns:cx4="http://schemas.microsoft.com/office/drawing/2016/5/10/chartex" xmlns:cx3="http://schemas.microsoft.com/office/drawing/2016/5/9/chartex" xmlns:cx2="http://schemas.microsoft.com/office/drawing/2015/10/21/chartex" xmlns:cx1="http://schemas.microsoft.com/office/drawing/2015/9/8/chartex">
             <w:pict w14:anchorId="4E4ED151">
               <v:line id="Conector recto 7" style="position:absolute;flip:y;z-index:251663361;visibility:visible;mso-wrap-style:square;mso-wrap-distance-left:9pt;mso-wrap-distance-top:0;mso-wrap-distance-right:9pt;mso-wrap-distance-bottom:0;mso-position-horizontal:absolute;mso-position-horizontal-relative:text;mso-position-vertical:absolute;mso-position-vertical-relative:text" o:spid="_x0000_s1026" strokecolor="#f60" strokeweight="1pt" from="4.4pt,13.95pt" to="316.3pt,14.7pt" w14:anchorId="07D2DC7C" o:gfxdata="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">
                 <v:stroke joinstyle="miter"/>
@@ -539,7 +543,7 @@
           <w:rFonts w:asciiTheme="majorHAnsi" w:hAnsiTheme="majorHAnsi" w:cstheme="majorHAnsi"/>
           <w:noProof/>
           <w:color w:val="FFFFFF" w:themeColor="background1"/>
-          <w:lang w:val="es-ES"/>
+          <w:lang w:eastAsia="es-CO"/>
         </w:rPr>
         <mc:AlternateContent>
           <mc:Choice Requires="wps">
@@ -650,7 +654,7 @@
               </wp:anchor>
             </w:drawing>
           </mc:Choice>
-          <mc:Fallback>
+          <mc:Fallback xmlns:w16sdtfl="http://schemas.microsoft.com/office/word/2024/wordml/sdtformatlock" xmlns:w16sdtdh="http://schemas.microsoft.com/office/word/2020/wordml/sdtdatahash" xmlns:w16du="http://schemas.microsoft.com/office/word/2023/wordml/word16du" xmlns:w16="http://schemas.microsoft.com/office/word/2018/wordml" xmlns:w16cid="http://schemas.microsoft.com/office/word/2016/wordml/cid" xmlns:w16cex="http://schemas.microsoft.com/office/word/2018/wordml/cex" xmlns:oel="http://schemas.microsoft.com/office/2019/extlst" xmlns:am3d="http://schemas.microsoft.com/office/drawing/2017/model3d" xmlns:aink="http://schemas.microsoft.com/office/drawing/2016/ink" xmlns:cx8="http://schemas.microsoft.com/office/drawing/2016/5/14/chartex" xmlns:cx7="http://schemas.microsoft.com/office/drawing/2016/5/13/chartex" xmlns:cx6="http://schemas.microsoft.com/office/drawing/2016/5/12/chartex" xmlns:cx5="http://schemas.microsoft.com/office/drawing/2016/5/11/chartex" xmlns:cx4="http://schemas.microsoft.com/office/drawing/2016/5/10/chartex" xmlns:cx3="http://schemas.microsoft.com/office/drawing/2016/5/9/chartex" xmlns:cx2="http://schemas.microsoft.com/office/drawing/2015/10/21/chartex" xmlns:cx1="http://schemas.microsoft.com/office/drawing/2015/9/8/chartex">
             <w:pict>
               <v:shape w14:anchorId="7AC8578E" id="Cuadro de texto 8" o:spid="_x0000_s1027" type="#_x0000_t202" style="position:absolute;margin-left:0;margin-top:14.05pt;width:348pt;height:65.25pt;z-index:251658242;visibility:visible;mso-wrap-style:square;mso-width-percent:0;mso-height-percent:0;mso-wrap-distance-left:9pt;mso-wrap-distance-top:0;mso-wrap-distance-right:9pt;mso-wrap-distance-bottom:0;mso-position-horizontal:left;mso-position-horizontal-relative:margin;mso-position-vertical:absolute;mso-position-vertical-relative:text;mso-width-percent:0;mso-height-percent:0;mso-width-relative:margin;mso-height-relative:margin;v-text-anchor:top" o:gfxdata="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" fillcolor="white [3201]" stroked="f" strokeweight=".5pt">
                 <v:textbox>
@@ -1055,7 +1059,7 @@
               </wp:anchor>
             </w:drawing>
           </mc:Choice>
-          <mc:Fallback>
+          <mc:Fallback xmlns:w16sdtfl="http://schemas.microsoft.com/office/word/2024/wordml/sdtformatlock" xmlns:w16sdtdh="http://schemas.microsoft.com/office/word/2020/wordml/sdtdatahash" xmlns:w16du="http://schemas.microsoft.com/office/word/2023/wordml/word16du" xmlns:w16="http://schemas.microsoft.com/office/word/2018/wordml" xmlns:w16cid="http://schemas.microsoft.com/office/word/2016/wordml/cid" xmlns:w16cex="http://schemas.microsoft.com/office/word/2018/wordml/cex" xmlns:oel="http://schemas.microsoft.com/office/2019/extlst" xmlns:am3d="http://schemas.microsoft.com/office/drawing/2017/model3d" xmlns:aink="http://schemas.microsoft.com/office/drawing/2016/ink" xmlns:cx8="http://schemas.microsoft.com/office/drawing/2016/5/14/chartex" xmlns:cx7="http://schemas.microsoft.com/office/drawing/2016/5/13/chartex" xmlns:cx6="http://schemas.microsoft.com/office/drawing/2016/5/12/chartex" xmlns:cx5="http://schemas.microsoft.com/office/drawing/2016/5/11/chartex" xmlns:cx4="http://schemas.microsoft.com/office/drawing/2016/5/10/chartex" xmlns:cx3="http://schemas.microsoft.com/office/drawing/2016/5/9/chartex" xmlns:cx2="http://schemas.microsoft.com/office/drawing/2015/10/21/chartex" xmlns:cx1="http://schemas.microsoft.com/office/drawing/2015/9/8/chartex">
             <w:pict>
               <v:rect w14:anchorId="083B4C96" id="Rectángulo 3" o:spid="_x0000_s1028" style="position:absolute;margin-left:-31.8pt;margin-top:-19.85pt;width:7in;height:45.75pt;z-index:251658241;visibility:visible;mso-wrap-style:square;mso-width-percent:0;mso-height-percent:0;mso-wrap-distance-left:9pt;mso-wrap-distance-top:0;mso-wrap-distance-right:9pt;mso-wrap-distance-bottom:0;mso-position-horizontal:absolute;mso-position-horizontal-relative:margin;mso-position-vertical:absolute;mso-position-vertical-relative:text;mso-width-percent:0;mso-height-percent:0;mso-width-relative:margin;mso-height-relative:margin;v-text-anchor:middle" o:gfxdata="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" fillcolor="#dadada" strokecolor="gray [1629]" strokeweight="1pt">
                 <v:textbox>
@@ -1754,7 +1758,7 @@
             <w:r>
               <w:t>V</w:t>
             </w:r>
-            <w:del w:id="6" w:author="Ing Angelo Rodriguez" w:date="2025-07-17T14:33:00Z" w16du:dateUtc="2025-07-17T19:33:00Z">
+            <w:del w:id="3" w:author="Ing Angelo Rodriguez" w:date="2025-07-17T14:33:00Z">
               <w:r>
                 <w:delText>Según plan de estudios</w:delText>
               </w:r>
@@ -3632,6 +3636,7 @@
               <w:rPr>
                 <w:rFonts w:cstheme="minorHAnsi"/>
               </w:rPr>
+              <w:lastRenderedPageBreak/>
               <w:t>S</w:t>
             </w:r>
             <w:r>
@@ -3688,7 +3693,6 @@
                 <w:b/>
                 <w:bCs/>
               </w:rPr>
-              <w:lastRenderedPageBreak/>
               <w:t xml:space="preserve">Etapa 1. Contextualización </w:t>
             </w:r>
           </w:p>
@@ -3720,7 +3724,7 @@
               <w:rPr>
                 <w:b/>
                 <w:noProof/>
-                <w:lang w:val="es-ES" w:eastAsia="es-ES"/>
+                <w:lang w:eastAsia="es-CO"/>
               </w:rPr>
               <w:drawing>
                 <wp:inline distT="0" distB="0" distL="0" distR="0" wp14:anchorId="3FE71C84" wp14:editId="3F31C40D">
@@ -3989,7 +3993,11 @@
               <w:t xml:space="preserve">, con los cuales, </w:t>
             </w:r>
             <w:r>
-              <w:t>A partir de la información obtenida desarrolla un modelo que permita caracterizar el comportamiento de los datos</w:t>
+              <w:t xml:space="preserve">A partir de la </w:t>
+            </w:r>
+            <w:r>
+              <w:lastRenderedPageBreak/>
+              <w:t>información obtenida desarrolla un modelo que permita caracterizar el comportamiento de los datos</w:t>
             </w:r>
             <w:r>
               <w:t xml:space="preserve"> y el comportamiento deseado</w:t>
@@ -4029,7 +4037,6 @@
               <w:rPr>
                 <w:bCs/>
               </w:rPr>
-              <w:lastRenderedPageBreak/>
               <w:t>Aplicación de sistemas digitales mediante el desarrollo de un proyecto final</w:t>
             </w:r>
             <w:r>
@@ -4180,15 +4187,7 @@
               <w:t>Autoevaluación</w:t>
             </w:r>
             <w:r>
-              <w:t>: El estudiante valora sus propios desempeños, identificando el nivel alcanzado en cada momento, a partir de la revisión crítica y transparente de su propio proceso, atendiendo a unos criterios de realización/</w:t>
-            </w:r>
-            <w:proofErr w:type="gramStart"/>
-            <w:r>
-              <w:t>desempeño establecidos</w:t>
-            </w:r>
-            <w:proofErr w:type="gramEnd"/>
-            <w:r>
-              <w:t xml:space="preserve"> para estimar el nivel de competencia, detectando con ello fortalezas, talentos, capacidades especiales al igual que dificultades, limitantes y oportunidades de mejora.</w:t>
+              <w:t>: El estudiante valora sus propios desempeños, identificando el nivel alcanzado en cada momento, a partir de la revisión crítica y transparente de su propio proceso, atendiendo a unos criterios de realización/desempeño establecidos para estimar el nivel de competencia, detectando con ello fortalezas, talentos, capacidades especiales al igual que dificultades, limitantes y oportunidades de mejora.</w:t>
             </w:r>
           </w:p>
           <w:p>
@@ -4209,15 +4208,7 @@
               <w:t>Coevaluación</w:t>
             </w:r>
             <w:r>
-              <w:t>: Los estudiantes realizan una valoración conjunta sobre la actuación del grupo, atendiendo a unos criterios de realización/</w:t>
-            </w:r>
-            <w:proofErr w:type="gramStart"/>
-            <w:r>
-              <w:t>desempeño establecidos</w:t>
-            </w:r>
-            <w:proofErr w:type="gramEnd"/>
-            <w:r>
-              <w:t xml:space="preserve"> en consenso; participando así en la valoración de los niveles de desempeño evidenciados.</w:t>
+              <w:t>: Los estudiantes realizan una valoración conjunta sobre la actuación del grupo, atendiendo a unos criterios de realización/desempeño establecidos en consenso; participando así en la valoración de los niveles de desempeño evidenciados.</w:t>
             </w:r>
           </w:p>
           <w:p>
@@ -4515,6 +4506,7 @@
               <w:ind w:left="1440" w:hanging="567"/>
             </w:pPr>
             <w:r>
+              <w:lastRenderedPageBreak/>
               <w:t xml:space="preserve">1.4. </w:t>
             </w:r>
             <w:r>
@@ -4554,7 +4546,6 @@
               <w:ind w:left="1440" w:hanging="567"/>
             </w:pPr>
             <w:r>
-              <w:lastRenderedPageBreak/>
               <w:t xml:space="preserve">1.7. </w:t>
             </w:r>
             <w:r>
@@ -4962,7 +4953,7 @@
               </w:rPr>
               <w:t>Como evidencia del proceso de consolidación de los saberes y competencias desarrollado durante el curso, se plantea el desarrollo de un proyecto final de aula</w:t>
             </w:r>
-            <w:ins w:id="7" w:author="Ing Angelo Rodriguez" w:date="2025-07-17T14:37:00Z" w16du:dateUtc="2025-07-17T19:37:00Z">
+            <w:ins w:id="4" w:author="Ing Angelo Rodriguez" w:date="2025-07-17T14:37:00Z">
               <w:r>
                 <w:rPr>
                   <w:rFonts w:cstheme="minorHAnsi"/>
@@ -6919,23 +6910,7 @@
                 <w:sz w:val="16"/>
                 <w:szCs w:val="16"/>
               </w:rPr>
-              <w:t xml:space="preserve"> </w:t>
-            </w:r>
-            <w:proofErr w:type="spellStart"/>
-            <w:r>
-              <w:rPr>
-                <w:sz w:val="16"/>
-                <w:szCs w:val="16"/>
-              </w:rPr>
-              <w:t>of</w:t>
-            </w:r>
-            <w:proofErr w:type="spellEnd"/>
-            <w:r>
-              <w:rPr>
-                <w:sz w:val="16"/>
-                <w:szCs w:val="16"/>
-              </w:rPr>
-              <w:t xml:space="preserve"> </w:t>
+              <w:t xml:space="preserve"> of </w:t>
             </w:r>
             <w:proofErr w:type="spellStart"/>
             <w:r>
@@ -7081,64 +7056,30 @@
                 <w:szCs w:val="16"/>
                 <w:lang w:val="en-US"/>
               </w:rPr>
-              <w:t xml:space="preserve">Brown, S., &amp; Rose, J. (1996). FPGA and CPLD </w:t>
-            </w:r>
-            <w:proofErr w:type="gramStart"/>
+              <w:t xml:space="preserve">Brown, S., &amp; Rose, J. (1996). FPGA and CPLD architectures: A tutorial. </w:t>
+            </w:r>
             <w:r>
               <w:rPr>
                 <w:sz w:val="16"/>
                 <w:szCs w:val="16"/>
-                <w:lang w:val="en-US"/>
-              </w:rPr>
-              <w:t>architectures</w:t>
-            </w:r>
-            <w:proofErr w:type="gramEnd"/>
+              </w:rPr>
+              <w:t xml:space="preserve">IEEE </w:t>
+            </w:r>
+            <w:proofErr w:type="spellStart"/>
             <w:r>
               <w:rPr>
                 <w:sz w:val="16"/>
                 <w:szCs w:val="16"/>
-                <w:lang w:val="en-US"/>
-              </w:rPr>
-              <w:t xml:space="preserve">: A tutorial. </w:t>
-            </w:r>
+              </w:rPr>
+              <w:t>design</w:t>
+            </w:r>
+            <w:proofErr w:type="spellEnd"/>
             <w:r>
               <w:rPr>
                 <w:sz w:val="16"/>
                 <w:szCs w:val="16"/>
               </w:rPr>
-              <w:t xml:space="preserve">IEEE </w:t>
-            </w:r>
-            <w:proofErr w:type="spellStart"/>
-            <w:r>
-              <w:rPr>
-                <w:sz w:val="16"/>
-                <w:szCs w:val="16"/>
-              </w:rPr>
-              <w:t>design</w:t>
-            </w:r>
-            <w:proofErr w:type="spellEnd"/>
-            <w:r>
-              <w:rPr>
-                <w:sz w:val="16"/>
-                <w:szCs w:val="16"/>
-              </w:rPr>
-              <w:t xml:space="preserve"> &amp; test </w:t>
-            </w:r>
-            <w:proofErr w:type="spellStart"/>
-            <w:r>
-              <w:rPr>
-                <w:sz w:val="16"/>
-                <w:szCs w:val="16"/>
-              </w:rPr>
-              <w:t>of</w:t>
-            </w:r>
-            <w:proofErr w:type="spellEnd"/>
-            <w:r>
-              <w:rPr>
-                <w:sz w:val="16"/>
-                <w:szCs w:val="16"/>
-              </w:rPr>
-              <w:t xml:space="preserve"> </w:t>
+              <w:t xml:space="preserve"> &amp; test of </w:t>
             </w:r>
             <w:proofErr w:type="spellStart"/>
             <w:r>
@@ -7237,7 +7178,7 @@
       <w:tr>
         <w:trPr>
           <w:trHeight w:val="1822"/>
-          <w:ins w:id="8" w:author="Martha Elisa Cuasquer Mora" w:date="2024-08-01T20:53:00Z"/>
+          <w:ins w:id="5" w:author="Martha Elisa Cuasquer Mora" w:date="2024-08-01T20:53:00Z"/>
         </w:trPr>
         <w:tc>
           <w:tcPr>
@@ -7262,7 +7203,7 @@
                 <w:sz w:val="16"/>
                 <w:szCs w:val="16"/>
                 <w:lang w:val="es-CO"/>
-                <w:rPrChange w:id="9" w:author="Ing Angelo Rodriguez" w:date="2025-07-17T14:30:00Z" w16du:dateUtc="2025-07-17T19:30:00Z">
+                <w:rPrChange w:id="6" w:author="Ing Angelo Rodriguez" w:date="2025-07-17T14:30:00Z">
                   <w:rPr>
                     <w:sz w:val="16"/>
                     <w:szCs w:val="16"/>
@@ -7271,6 +7212,16 @@
                 </w:rPrChange>
               </w:rPr>
             </w:pPr>
+            <w:r>
+              <w:rPr>
+                <w:sz w:val="16"/>
+                <w:szCs w:val="16"/>
+                <w:lang w:val="es-CO"/>
+              </w:rPr>
+              <w:t>sssss</w:t>
+            </w:r>
+            <w:bookmarkStart w:id="7" w:name="_GoBack"/>
+            <w:bookmarkEnd w:id="7"/>
           </w:p>
         </w:tc>
         <w:tc>
@@ -7370,7 +7321,7 @@
     <w:p>
       <w:pPr>
         <w:rPr>
-          <w:del w:id="10" w:author="Ing Angelo Rodriguez" w:date="2025-07-17T14:38:00Z" w16du:dateUtc="2025-07-17T19:38:00Z"/>
+          <w:del w:id="8" w:author="Ing Angelo Rodriguez" w:date="2025-07-17T14:38:00Z"/>
           <w:b/>
           <w:bCs/>
         </w:rPr>
@@ -7379,7 +7330,7 @@
     <w:p>
       <w:pPr>
         <w:rPr>
-          <w:del w:id="11" w:author="Ing Angelo Rodriguez" w:date="2025-07-17T14:38:00Z" w16du:dateUtc="2025-07-17T19:38:00Z"/>
+          <w:del w:id="9" w:author="Ing Angelo Rodriguez" w:date="2025-07-17T14:38:00Z"/>
           <w:b/>
           <w:bCs/>
         </w:rPr>
@@ -7388,7 +7339,7 @@
     <w:p>
       <w:pPr>
         <w:rPr>
-          <w:del w:id="12" w:author="Ing Angelo Rodriguez" w:date="2025-07-17T14:38:00Z" w16du:dateUtc="2025-07-17T19:38:00Z"/>
+          <w:del w:id="10" w:author="Ing Angelo Rodriguez" w:date="2025-07-17T14:38:00Z"/>
           <w:b/>
           <w:bCs/>
         </w:rPr>
@@ -7397,7 +7348,7 @@
     <w:p>
       <w:pPr>
         <w:rPr>
-          <w:del w:id="13" w:author="Ing Angelo Rodriguez" w:date="2025-07-17T14:38:00Z" w16du:dateUtc="2025-07-17T19:38:00Z"/>
+          <w:del w:id="11" w:author="Ing Angelo Rodriguez" w:date="2025-07-17T14:38:00Z"/>
           <w:b/>
           <w:bCs/>
         </w:rPr>
@@ -7406,7 +7357,7 @@
     <w:p>
       <w:pPr>
         <w:rPr>
-          <w:del w:id="14" w:author="Ing Angelo Rodriguez" w:date="2025-07-17T14:38:00Z" w16du:dateUtc="2025-07-17T19:38:00Z"/>
+          <w:del w:id="12" w:author="Ing Angelo Rodriguez" w:date="2025-07-17T14:38:00Z"/>
           <w:b/>
           <w:bCs/>
         </w:rPr>
@@ -7415,7 +7366,7 @@
     <w:p>
       <w:pPr>
         <w:rPr>
-          <w:ins w:id="15" w:author="Ing Angelo Rodriguez" w:date="2025-07-17T14:38:00Z" w16du:dateUtc="2025-07-17T19:38:00Z"/>
+          <w:ins w:id="13" w:author="Ing Angelo Rodriguez" w:date="2025-07-17T14:38:00Z"/>
           <w:b/>
           <w:bCs/>
         </w:rPr>
@@ -7424,7 +7375,7 @@
     <w:p>
       <w:pPr>
         <w:rPr>
-          <w:ins w:id="16" w:author="Ing Angelo Rodriguez" w:date="2025-07-17T14:38:00Z" w16du:dateUtc="2025-07-17T19:38:00Z"/>
+          <w:ins w:id="14" w:author="Ing Angelo Rodriguez" w:date="2025-07-17T14:38:00Z"/>
           <w:b/>
           <w:bCs/>
         </w:rPr>
@@ -7449,7 +7400,7 @@
     <w:p>
       <w:pPr>
         <w:rPr>
-          <w:del w:id="17" w:author="Ing Angelo Rodriguez" w:date="2025-07-17T14:38:00Z" w16du:dateUtc="2025-07-17T19:38:00Z"/>
+          <w:del w:id="15" w:author="Ing Angelo Rodriguez" w:date="2025-07-17T14:38:00Z"/>
           <w:b/>
         </w:rPr>
       </w:pPr>
@@ -7457,12 +7408,12 @@
     <w:p>
       <w:pPr>
         <w:rPr>
-          <w:del w:id="18" w:author="Ing Angelo Rodriguez" w:date="2025-07-17T14:38:00Z" w16du:dateUtc="2025-07-17T19:38:00Z"/>
+          <w:del w:id="16" w:author="Ing Angelo Rodriguez" w:date="2025-07-17T14:38:00Z"/>
           <w:b/>
           <w:lang w:val="en-US"/>
         </w:rPr>
       </w:pPr>
-      <w:del w:id="19" w:author="Ing Angelo Rodriguez" w:date="2025-07-17T14:38:00Z" w16du:dateUtc="2025-07-17T19:38:00Z">
+      <w:del w:id="17" w:author="Ing Angelo Rodriguez" w:date="2025-07-17T14:38:00Z">
         <w:r>
           <w:rPr>
             <w:b/>
@@ -7475,12 +7426,12 @@
     <w:p>
       <w:pPr>
         <w:rPr>
-          <w:del w:id="20" w:author="Ing Angelo Rodriguez" w:date="2025-07-17T14:38:00Z" w16du:dateUtc="2025-07-17T19:38:00Z"/>
+          <w:del w:id="18" w:author="Ing Angelo Rodriguez" w:date="2025-07-17T14:38:00Z"/>
           <w:b/>
           <w:lang w:val="en-US"/>
         </w:rPr>
       </w:pPr>
-      <w:del w:id="21" w:author="Ing Angelo Rodriguez" w:date="2025-07-17T14:38:00Z" w16du:dateUtc="2025-07-17T19:38:00Z">
+      <w:del w:id="19" w:author="Ing Angelo Rodriguez" w:date="2025-07-17T14:38:00Z">
         <w:r>
           <w:rPr>
             <w:b/>
@@ -7506,11 +7457,11 @@
     <w:p>
       <w:pPr>
         <w:rPr>
-          <w:del w:id="22" w:author="Ing Angelo Rodriguez" w:date="2025-07-17T14:38:00Z" w16du:dateUtc="2025-07-17T19:38:00Z"/>
+          <w:del w:id="20" w:author="Ing Angelo Rodriguez" w:date="2025-07-17T14:38:00Z"/>
           <w:b/>
         </w:rPr>
       </w:pPr>
-      <w:del w:id="23" w:author="Ing Angelo Rodriguez" w:date="2025-07-17T14:38:00Z" w16du:dateUtc="2025-07-17T19:38:00Z">
+      <w:del w:id="21" w:author="Ing Angelo Rodriguez" w:date="2025-07-17T14:38:00Z">
         <w:r>
           <w:rPr>
             <w:b/>
@@ -7534,12 +7485,12 @@
     <w:p>
       <w:pPr>
         <w:rPr>
-          <w:del w:id="24" w:author="Ing Angelo Rodriguez" w:date="2025-07-17T14:38:00Z" w16du:dateUtc="2025-07-17T19:38:00Z"/>
+          <w:del w:id="22" w:author="Ing Angelo Rodriguez" w:date="2025-07-17T14:38:00Z"/>
           <w:b/>
           <w:lang w:val="en-US"/>
         </w:rPr>
       </w:pPr>
-      <w:del w:id="25" w:author="Ing Angelo Rodriguez" w:date="2025-07-17T14:38:00Z" w16du:dateUtc="2025-07-17T19:38:00Z">
+      <w:del w:id="23" w:author="Ing Angelo Rodriguez" w:date="2025-07-17T14:38:00Z">
         <w:r>
           <w:rPr>
             <w:b/>
@@ -7558,12 +7509,12 @@
     <w:p>
       <w:pPr>
         <w:rPr>
-          <w:del w:id="26" w:author="Ing Angelo Rodriguez" w:date="2025-07-17T14:38:00Z" w16du:dateUtc="2025-07-17T19:38:00Z"/>
+          <w:del w:id="24" w:author="Ing Angelo Rodriguez" w:date="2025-07-17T14:38:00Z"/>
           <w:b/>
           <w:lang w:val="en-US"/>
         </w:rPr>
       </w:pPr>
-      <w:del w:id="27" w:author="Ing Angelo Rodriguez" w:date="2025-07-17T14:38:00Z" w16du:dateUtc="2025-07-17T19:38:00Z">
+      <w:del w:id="25" w:author="Ing Angelo Rodriguez" w:date="2025-07-17T14:38:00Z">
         <w:r>
           <w:rPr>
             <w:b/>
@@ -7597,12 +7548,12 @@
       <w:pPr>
         <w:jc w:val="both"/>
         <w:rPr>
-          <w:del w:id="28" w:author="Ing Angelo Rodriguez" w:date="2025-07-17T14:38:00Z" w16du:dateUtc="2025-07-17T19:38:00Z"/>
+          <w:del w:id="26" w:author="Ing Angelo Rodriguez" w:date="2025-07-17T14:38:00Z"/>
           <w:b/>
           <w:lang w:val="en-US"/>
         </w:rPr>
       </w:pPr>
-      <w:del w:id="29" w:author="Ing Angelo Rodriguez" w:date="2025-07-17T14:38:00Z" w16du:dateUtc="2025-07-17T19:38:00Z">
+      <w:del w:id="27" w:author="Ing Angelo Rodriguez" w:date="2025-07-17T14:38:00Z">
         <w:r>
           <w:rPr>
             <w:b/>
@@ -7637,11 +7588,11 @@
       <w:pPr>
         <w:jc w:val="both"/>
         <w:rPr>
-          <w:del w:id="30" w:author="Ing Angelo Rodriguez" w:date="2025-07-17T14:38:00Z" w16du:dateUtc="2025-07-17T19:38:00Z"/>
+          <w:del w:id="28" w:author="Ing Angelo Rodriguez" w:date="2025-07-17T14:38:00Z"/>
           <w:lang w:val="en-US"/>
         </w:rPr>
       </w:pPr>
-      <w:del w:id="31" w:author="Ing Angelo Rodriguez" w:date="2025-07-17T14:38:00Z" w16du:dateUtc="2025-07-17T19:38:00Z">
+      <w:del w:id="29" w:author="Ing Angelo Rodriguez" w:date="2025-07-17T14:38:00Z">
         <w:r>
           <w:rPr>
             <w:b/>
@@ -7660,11 +7611,11 @@
     <w:p>
       <w:pPr>
         <w:rPr>
-          <w:del w:id="32" w:author="Ing Angelo Rodriguez" w:date="2025-07-17T14:38:00Z" w16du:dateUtc="2025-07-17T19:38:00Z"/>
+          <w:del w:id="30" w:author="Ing Angelo Rodriguez" w:date="2025-07-17T14:38:00Z"/>
           <w:lang w:val="en-US"/>
         </w:rPr>
       </w:pPr>
-      <w:del w:id="33" w:author="Ing Angelo Rodriguez" w:date="2025-07-17T14:38:00Z" w16du:dateUtc="2025-07-17T19:38:00Z">
+      <w:del w:id="31" w:author="Ing Angelo Rodriguez" w:date="2025-07-17T14:38:00Z">
         <w:r>
           <w:rPr>
             <w:lang w:val="en-US"/>
@@ -7677,8 +7628,8 @@
       <w:r>
         <w:rPr>
           <w:noProof/>
+          <w:lang w:eastAsia="es-CO"/>
         </w:rPr>
-        <w:lastRenderedPageBreak/>
         <w:drawing>
           <wp:anchor distT="0" distB="0" distL="114300" distR="114300" simplePos="0" relativeHeight="251658246" behindDoc="0" locked="0" layoutInCell="1" allowOverlap="1" wp14:anchorId="537D9E28" wp14:editId="43EEFA46">
             <wp:simplePos x="0" y="0"/>
@@ -7756,7 +7707,7 @@
 </file>
 
 <file path=word/endnotes.xml><?xml version="1.0" encoding="utf-8"?>
-<w:endnotes xmlns:wpc="http://schemas.microsoft.com/office/word/2010/wordprocessingCanvas" xmlns:cx="http://schemas.microsoft.com/office/drawing/2014/chartex" xmlns:cx1="http://schemas.microsoft.com/office/drawing/2015/9/8/chartex" xmlns:cx2="http://schemas.microsoft.com/office/drawing/2015/10/21/chartex" xmlns:cx3="http://schemas.microsoft.com/office/drawing/2016/5/9/chartex" xmlns:cx4="http://schemas.microsoft.com/office/drawing/2016/5/10/chartex" xmlns:cx5="http://schemas.microsoft.com/office/drawing/2016/5/11/chartex" xmlns:cx6="http://schemas.microsoft.com/office/drawing/2016/5/12/chartex" xmlns:cx7="http://schemas.microsoft.com/office/drawing/2016/5/13/chartex" xmlns:cx8="http://schemas.microsoft.com/office/drawing/2016/5/14/chartex" xmlns:mc="http://schemas.openxmlformats.org/markup-compatibility/2006" xmlns:aink="http://schemas.microsoft.com/office/drawing/2016/ink" xmlns:am3d="http://schemas.microsoft.com/office/drawing/2017/model3d" xmlns:o="urn:schemas-microsoft-com:office:office" xmlns:oel="http://schemas.microsoft.com/office/2019/extlst" xmlns:r="http://schemas.openxmlformats.org/officeDocument/2006/relationships" xmlns:m="http://schemas.openxmlformats.org/officeDocument/2006/math" xmlns:v="urn:schemas-microsoft-com:vml" xmlns:wp14="http://schemas.microsoft.com/office/word/2010/wordprocessingDrawing" xmlns:wp="http://schemas.openxmlformats.org/drawingml/2006/wordprocessingDrawing" xmlns:w10="urn:schemas-microsoft-com:office:word" xmlns:w="http://schemas.openxmlformats.org/wordprocessingml/2006/main" xmlns:w14="http://schemas.microsoft.com/office/word/2010/wordml" xmlns:w15="http://schemas.microsoft.com/office/word/2012/wordml" xmlns:w16cex="http://schemas.microsoft.com/office/word/2018/wordml/cex" xmlns:w16cid="http://schemas.microsoft.com/office/word/2016/wordml/cid" xmlns:w16="http://schemas.microsoft.com/office/word/2018/wordml" xmlns:w16du="http://schemas.microsoft.com/office/word/2023/wordml/word16du" xmlns:w16sdtdh="http://schemas.microsoft.com/office/word/2020/wordml/sdtdatahash" xmlns:w16sdtfl="http://schemas.microsoft.com/office/word/2024/wordml/sdtformatlock" xmlns:w16se="http://schemas.microsoft.com/office/word/2015/wordml/symex" xmlns:wpg="http://schemas.microsoft.com/office/word/2010/wordprocessingGroup" xmlns:wpi="http://schemas.microsoft.com/office/word/2010/wordprocessingInk" xmlns:wne="http://schemas.microsoft.com/office/word/2006/wordml" xmlns:wps="http://schemas.microsoft.com/office/word/2010/wordprocessingShape" mc:Ignorable="w14 w15 w16se w16cid w16 w16cex w16sdtdh w16sdtfl w16du wp14">
+<w:endnotes xmlns:wpc="http://schemas.microsoft.com/office/word/2010/wordprocessingCanvas" xmlns:cx="http://schemas.microsoft.com/office/drawing/2014/chartex" xmlns:mc="http://schemas.openxmlformats.org/markup-compatibility/2006" xmlns:o="urn:schemas-microsoft-com:office:office" xmlns:r="http://schemas.openxmlformats.org/officeDocument/2006/relationships" xmlns:m="http://schemas.openxmlformats.org/officeDocument/2006/math" xmlns:v="urn:schemas-microsoft-com:vml" xmlns:wp14="http://schemas.microsoft.com/office/word/2010/wordprocessingDrawing" xmlns:wp="http://schemas.openxmlformats.org/drawingml/2006/wordprocessingDrawing" xmlns:w10="urn:schemas-microsoft-com:office:word" xmlns:w="http://schemas.openxmlformats.org/wordprocessingml/2006/main" xmlns:w14="http://schemas.microsoft.com/office/word/2010/wordml" xmlns:w15="http://schemas.microsoft.com/office/word/2012/wordml" xmlns:w16se="http://schemas.microsoft.com/office/word/2015/wordml/symex" xmlns:wpg="http://schemas.microsoft.com/office/word/2010/wordprocessingGroup" xmlns:wpi="http://schemas.microsoft.com/office/word/2010/wordprocessingInk" xmlns:wne="http://schemas.microsoft.com/office/word/2006/wordml" xmlns:wps="http://schemas.microsoft.com/office/word/2010/wordprocessingShape" mc:Ignorable="w14 w15 w16se wp14">
   <w:endnote w:type="separator" w:id="-1">
     <w:p>
       <w:pPr>
@@ -7788,7 +7739,7 @@
 </file>
 
 <file path=word/footer1.xml><?xml version="1.0" encoding="utf-8"?>
-<w:ftr xmlns:wpc="http://schemas.microsoft.com/office/word/2010/wordprocessingCanvas" xmlns:cx="http://schemas.microsoft.com/office/drawing/2014/chartex" xmlns:cx1="http://schemas.microsoft.com/office/drawing/2015/9/8/chartex" xmlns:cx2="http://schemas.microsoft.com/office/drawing/2015/10/21/chartex" xmlns:cx3="http://schemas.microsoft.com/office/drawing/2016/5/9/chartex" xmlns:cx4="http://schemas.microsoft.com/office/drawing/2016/5/10/chartex" xmlns:cx5="http://schemas.microsoft.com/office/drawing/2016/5/11/chartex" xmlns:cx6="http://schemas.microsoft.com/office/drawing/2016/5/12/chartex" xmlns:cx7="http://schemas.microsoft.com/office/drawing/2016/5/13/chartex" xmlns:cx8="http://schemas.microsoft.com/office/drawing/2016/5/14/chartex" xmlns:mc="http://schemas.openxmlformats.org/markup-compatibility/2006" xmlns:aink="http://schemas.microsoft.com/office/drawing/2016/ink" xmlns:am3d="http://schemas.microsoft.com/office/drawing/2017/model3d" xmlns:o="urn:schemas-microsoft-com:office:office" xmlns:oel="http://schemas.microsoft.com/office/2019/extlst" xmlns:r="http://schemas.openxmlformats.org/officeDocument/2006/relationships" xmlns:m="http://schemas.openxmlformats.org/officeDocument/2006/math" xmlns:v="urn:schemas-microsoft-com:vml" xmlns:wp14="http://schemas.microsoft.com/office/word/2010/wordprocessingDrawing" xmlns:wp="http://schemas.openxmlformats.org/drawingml/2006/wordprocessingDrawing" xmlns:w10="urn:schemas-microsoft-com:office:word" xmlns:w="http://schemas.openxmlformats.org/wordprocessingml/2006/main" xmlns:w14="http://schemas.microsoft.com/office/word/2010/wordml" xmlns:w15="http://schemas.microsoft.com/office/word/2012/wordml" xmlns:w16cex="http://schemas.microsoft.com/office/word/2018/wordml/cex" xmlns:w16cid="http://schemas.microsoft.com/office/word/2016/wordml/cid" xmlns:w16="http://schemas.microsoft.com/office/word/2018/wordml" xmlns:w16du="http://schemas.microsoft.com/office/word/2023/wordml/word16du" xmlns:w16sdtdh="http://schemas.microsoft.com/office/word/2020/wordml/sdtdatahash" xmlns:w16sdtfl="http://schemas.microsoft.com/office/word/2024/wordml/sdtformatlock" xmlns:w16se="http://schemas.microsoft.com/office/word/2015/wordml/symex" xmlns:wpg="http://schemas.microsoft.com/office/word/2010/wordprocessingGroup" xmlns:wpi="http://schemas.microsoft.com/office/word/2010/wordprocessingInk" xmlns:wne="http://schemas.microsoft.com/office/word/2006/wordml" xmlns:wps="http://schemas.microsoft.com/office/word/2010/wordprocessingShape" mc:Ignorable="w14 w15 w16se w16cid w16 w16cex w16sdtdh w16sdtfl w16du wp14">
+<w:ftr xmlns:wpc="http://schemas.microsoft.com/office/word/2010/wordprocessingCanvas" xmlns:cx="http://schemas.microsoft.com/office/drawing/2014/chartex" xmlns:mc="http://schemas.openxmlformats.org/markup-compatibility/2006" xmlns:o="urn:schemas-microsoft-com:office:office" xmlns:r="http://schemas.openxmlformats.org/officeDocument/2006/relationships" xmlns:m="http://schemas.openxmlformats.org/officeDocument/2006/math" xmlns:v="urn:schemas-microsoft-com:vml" xmlns:wp14="http://schemas.microsoft.com/office/word/2010/wordprocessingDrawing" xmlns:wp="http://schemas.openxmlformats.org/drawingml/2006/wordprocessingDrawing" xmlns:w10="urn:schemas-microsoft-com:office:word" xmlns:w="http://schemas.openxmlformats.org/wordprocessingml/2006/main" xmlns:w14="http://schemas.microsoft.com/office/word/2010/wordml" xmlns:w15="http://schemas.microsoft.com/office/word/2012/wordml" xmlns:w16se="http://schemas.microsoft.com/office/word/2015/wordml/symex" xmlns:wpg="http://schemas.microsoft.com/office/word/2010/wordprocessingGroup" xmlns:wpi="http://schemas.microsoft.com/office/word/2010/wordprocessingInk" xmlns:wne="http://schemas.microsoft.com/office/word/2006/wordml" xmlns:wps="http://schemas.microsoft.com/office/word/2010/wordprocessingShape" mc:Ignorable="w14 w15 w16se wp14">
   <w:p>
     <w:pPr>
       <w:pStyle w:val="Piedepgina"/>
@@ -7828,7 +7779,7 @@
 </file>
 
 <file path=word/footnotes.xml><?xml version="1.0" encoding="utf-8"?>
-<w:footnotes xmlns:wpc="http://schemas.microsoft.com/office/word/2010/wordprocessingCanvas" xmlns:cx="http://schemas.microsoft.com/office/drawing/2014/chartex" xmlns:cx1="http://schemas.microsoft.com/office/drawing/2015/9/8/chartex" xmlns:cx2="http://schemas.microsoft.com/office/drawing/2015/10/21/chartex" xmlns:cx3="http://schemas.microsoft.com/office/drawing/2016/5/9/chartex" xmlns:cx4="http://schemas.microsoft.com/office/drawing/2016/5/10/chartex" xmlns:cx5="http://schemas.microsoft.com/office/drawing/2016/5/11/chartex" xmlns:cx6="http://schemas.microsoft.com/office/drawing/2016/5/12/chartex" xmlns:cx7="http://schemas.microsoft.com/office/drawing/2016/5/13/chartex" xmlns:cx8="http://schemas.microsoft.com/office/drawing/2016/5/14/chartex" xmlns:mc="http://schemas.openxmlformats.org/markup-compatibility/2006" xmlns:aink="http://schemas.microsoft.com/office/drawing/2016/ink" xmlns:am3d="http://schemas.microsoft.com/office/drawing/2017/model3d" xmlns:o="urn:schemas-microsoft-com:office:office" xmlns:oel="http://schemas.microsoft.com/office/2019/extlst" xmlns:r="http://schemas.openxmlformats.org/officeDocument/2006/relationships" xmlns:m="http://schemas.openxmlformats.org/officeDocument/2006/math" xmlns:v="urn:schemas-microsoft-com:vml" xmlns:wp14="http://schemas.microsoft.com/office/word/2010/wordprocessingDrawing" xmlns:wp="http://schemas.openxmlformats.org/drawingml/2006/wordprocessingDrawing" xmlns:w10="urn:schemas-microsoft-com:office:word" xmlns:w="http://schemas.openxmlformats.org/wordprocessingml/2006/main" xmlns:w14="http://schemas.microsoft.com/office/word/2010/wordml" xmlns:w15="http://schemas.microsoft.com/office/word/2012/wordml" xmlns:w16cex="http://schemas.microsoft.com/office/word/2018/wordml/cex" xmlns:w16cid="http://schemas.microsoft.com/office/word/2016/wordml/cid" xmlns:w16="http://schemas.microsoft.com/office/word/2018/wordml" xmlns:w16du="http://schemas.microsoft.com/office/word/2023/wordml/word16du" xmlns:w16sdtdh="http://schemas.microsoft.com/office/word/2020/wordml/sdtdatahash" xmlns:w16sdtfl="http://schemas.microsoft.com/office/word/2024/wordml/sdtformatlock" xmlns:w16se="http://schemas.microsoft.com/office/word/2015/wordml/symex" xmlns:wpg="http://schemas.microsoft.com/office/word/2010/wordprocessingGroup" xmlns:wpi="http://schemas.microsoft.com/office/word/2010/wordprocessingInk" xmlns:wne="http://schemas.microsoft.com/office/word/2006/wordml" xmlns:wps="http://schemas.microsoft.com/office/word/2010/wordprocessingShape" mc:Ignorable="w14 w15 w16se w16cid w16 w16cex w16sdtdh w16sdtfl w16du wp14">
+<w:footnotes xmlns:wpc="http://schemas.microsoft.com/office/word/2010/wordprocessingCanvas" xmlns:cx="http://schemas.microsoft.com/office/drawing/2014/chartex" xmlns:mc="http://schemas.openxmlformats.org/markup-compatibility/2006" xmlns:o="urn:schemas-microsoft-com:office:office" xmlns:r="http://schemas.openxmlformats.org/officeDocument/2006/relationships" xmlns:m="http://schemas.openxmlformats.org/officeDocument/2006/math" xmlns:v="urn:schemas-microsoft-com:vml" xmlns:wp14="http://schemas.microsoft.com/office/word/2010/wordprocessingDrawing" xmlns:wp="http://schemas.openxmlformats.org/drawingml/2006/wordprocessingDrawing" xmlns:w10="urn:schemas-microsoft-com:office:word" xmlns:w="http://schemas.openxmlformats.org/wordprocessingml/2006/main" xmlns:w14="http://schemas.microsoft.com/office/word/2010/wordml" xmlns:w15="http://schemas.microsoft.com/office/word/2012/wordml" xmlns:w16se="http://schemas.microsoft.com/office/word/2015/wordml/symex" xmlns:wpg="http://schemas.microsoft.com/office/word/2010/wordprocessingGroup" xmlns:wpi="http://schemas.microsoft.com/office/word/2010/wordprocessingInk" xmlns:wne="http://schemas.microsoft.com/office/word/2006/wordml" xmlns:wps="http://schemas.microsoft.com/office/word/2010/wordprocessingShape" mc:Ignorable="w14 w15 w16se wp14">
   <w:footnote w:type="separator" w:id="-1">
     <w:p>
       <w:pPr>
@@ -7860,7 +7811,7 @@
 </file>
 
 <file path=word/header1.xml><?xml version="1.0" encoding="utf-8"?>
-<w:hdr xmlns:wpc="http://schemas.microsoft.com/office/word/2010/wordprocessingCanvas" xmlns:cx="http://schemas.microsoft.com/office/drawing/2014/chartex" xmlns:cx1="http://schemas.microsoft.com/office/drawing/2015/9/8/chartex" xmlns:cx2="http://schemas.microsoft.com/office/drawing/2015/10/21/chartex" xmlns:cx3="http://schemas.microsoft.com/office/drawing/2016/5/9/chartex" xmlns:cx4="http://schemas.microsoft.com/office/drawing/2016/5/10/chartex" xmlns:cx5="http://schemas.microsoft.com/office/drawing/2016/5/11/chartex" xmlns:cx6="http://schemas.microsoft.com/office/drawing/2016/5/12/chartex" xmlns:cx7="http://schemas.microsoft.com/office/drawing/2016/5/13/chartex" xmlns:cx8="http://schemas.microsoft.com/office/drawing/2016/5/14/chartex" xmlns:mc="http://schemas.openxmlformats.org/markup-compatibility/2006" xmlns:aink="http://schemas.microsoft.com/office/drawing/2016/ink" xmlns:am3d="http://schemas.microsoft.com/office/drawing/2017/model3d" xmlns:o="urn:schemas-microsoft-com:office:office" xmlns:oel="http://schemas.microsoft.com/office/2019/extlst" xmlns:r="http://schemas.openxmlformats.org/officeDocument/2006/relationships" xmlns:m="http://schemas.openxmlformats.org/officeDocument/2006/math" xmlns:v="urn:schemas-microsoft-com:vml" xmlns:wp14="http://schemas.microsoft.com/office/word/2010/wordprocessingDrawing" xmlns:wp="http://schemas.openxmlformats.org/drawingml/2006/wordprocessingDrawing" xmlns:w10="urn:schemas-microsoft-com:office:word" xmlns:w="http://schemas.openxmlformats.org/wordprocessingml/2006/main" xmlns:w14="http://schemas.microsoft.com/office/word/2010/wordml" xmlns:w15="http://schemas.microsoft.com/office/word/2012/wordml" xmlns:w16cex="http://schemas.microsoft.com/office/word/2018/wordml/cex" xmlns:w16cid="http://schemas.microsoft.com/office/word/2016/wordml/cid" xmlns:w16="http://schemas.microsoft.com/office/word/2018/wordml" xmlns:w16du="http://schemas.microsoft.com/office/word/2023/wordml/word16du" xmlns:w16sdtdh="http://schemas.microsoft.com/office/word/2020/wordml/sdtdatahash" xmlns:w16sdtfl="http://schemas.microsoft.com/office/word/2024/wordml/sdtformatlock" xmlns:w16se="http://schemas.microsoft.com/office/word/2015/wordml/symex" xmlns:wpg="http://schemas.microsoft.com/office/word/2010/wordprocessingGroup" xmlns:wpi="http://schemas.microsoft.com/office/word/2010/wordprocessingInk" xmlns:wne="http://schemas.microsoft.com/office/word/2006/wordml" xmlns:wps="http://schemas.microsoft.com/office/word/2010/wordprocessingShape" mc:Ignorable="w14 w15 w16se w16cid w16 w16cex w16sdtdh w16sdtfl w16du wp14">
+<w:hdr xmlns:wpc="http://schemas.microsoft.com/office/word/2010/wordprocessingCanvas" xmlns:cx="http://schemas.microsoft.com/office/drawing/2014/chartex" xmlns:mc="http://schemas.openxmlformats.org/markup-compatibility/2006" xmlns:o="urn:schemas-microsoft-com:office:office" xmlns:r="http://schemas.openxmlformats.org/officeDocument/2006/relationships" xmlns:m="http://schemas.openxmlformats.org/officeDocument/2006/math" xmlns:v="urn:schemas-microsoft-com:vml" xmlns:wp14="http://schemas.microsoft.com/office/word/2010/wordprocessingDrawing" xmlns:wp="http://schemas.openxmlformats.org/drawingml/2006/wordprocessingDrawing" xmlns:w10="urn:schemas-microsoft-com:office:word" xmlns:w="http://schemas.openxmlformats.org/wordprocessingml/2006/main" xmlns:w14="http://schemas.microsoft.com/office/word/2010/wordml" xmlns:w15="http://schemas.microsoft.com/office/word/2012/wordml" xmlns:w16se="http://schemas.microsoft.com/office/word/2015/wordml/symex" xmlns:wpg="http://schemas.microsoft.com/office/word/2010/wordprocessingGroup" xmlns:wpi="http://schemas.microsoft.com/office/word/2010/wordprocessingInk" xmlns:wne="http://schemas.microsoft.com/office/word/2006/wordml" xmlns:wps="http://schemas.microsoft.com/office/word/2010/wordprocessingShape" mc:Ignorable="w14 w15 w16se wp14">
   <w:p>
     <w:pPr>
       <w:pStyle w:val="Encabezado"/>
@@ -7873,6 +7824,7 @@
     <w:r>
       <w:rPr>
         <w:noProof/>
+        <w:lang w:eastAsia="es-CO"/>
       </w:rPr>
       <w:drawing>
         <wp:anchor distT="0" distB="0" distL="114300" distR="114300" simplePos="0" relativeHeight="251658241" behindDoc="0" locked="0" layoutInCell="1" allowOverlap="1" wp14:anchorId="271CBBE5" wp14:editId="56091B02">
@@ -7972,6 +7924,7 @@
         <w:b/>
         <w:bCs/>
         <w:noProof/>
+        <w:lang w:eastAsia="es-CO"/>
       </w:rPr>
       <mc:AlternateContent>
         <mc:Choice Requires="wps">
@@ -8064,7 +8017,7 @@
             </wp:anchor>
           </w:drawing>
         </mc:Choice>
-        <mc:Fallback>
+        <mc:Fallback xmlns:w16sdtfl="http://schemas.microsoft.com/office/word/2024/wordml/sdtformatlock" xmlns:w16sdtdh="http://schemas.microsoft.com/office/word/2020/wordml/sdtdatahash" xmlns:w16du="http://schemas.microsoft.com/office/word/2023/wordml/word16du" xmlns:w16="http://schemas.microsoft.com/office/word/2018/wordml" xmlns:w16cid="http://schemas.microsoft.com/office/word/2016/wordml/cid" xmlns:w16cex="http://schemas.microsoft.com/office/word/2018/wordml/cex" xmlns:oel="http://schemas.microsoft.com/office/2019/extlst" xmlns:am3d="http://schemas.microsoft.com/office/drawing/2017/model3d" xmlns:aink="http://schemas.microsoft.com/office/drawing/2016/ink" xmlns:cx8="http://schemas.microsoft.com/office/drawing/2016/5/14/chartex" xmlns:cx7="http://schemas.microsoft.com/office/drawing/2016/5/13/chartex" xmlns:cx6="http://schemas.microsoft.com/office/drawing/2016/5/12/chartex" xmlns:cx5="http://schemas.microsoft.com/office/drawing/2016/5/11/chartex" xmlns:cx4="http://schemas.microsoft.com/office/drawing/2016/5/10/chartex" xmlns:cx3="http://schemas.microsoft.com/office/drawing/2016/5/9/chartex" xmlns:cx2="http://schemas.microsoft.com/office/drawing/2015/10/21/chartex" xmlns:cx1="http://schemas.microsoft.com/office/drawing/2015/9/8/chartex">
           <w:pict>
             <v:rect w14:anchorId="50541001" id="Título 1" o:spid="_x0000_s1029" style="position:absolute;left:0;text-align:left;margin-left:-37.9pt;margin-top:-10.95pt;width:241.75pt;height:30.5pt;z-index:251658240;visibility:visible;mso-wrap-style:square;mso-wrap-distance-left:9pt;mso-wrap-distance-top:0;mso-wrap-distance-right:9pt;mso-wrap-distance-bottom:0;mso-position-horizontal:absolute;mso-position-horizontal-relative:text;mso-position-vertical:absolute;mso-position-vertical-relative:text;v-text-anchor:bottom" o:gfxdata="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" filled="f" stroked="f">
               <o:lock v:ext="edit" grouping="t"/>
@@ -8143,7 +8096,7 @@
 </file>
 
 <file path=word/numbering.xml><?xml version="1.0" encoding="utf-8"?>
-<w:numbering xmlns:wpc="http://schemas.microsoft.com/office/word/2010/wordprocessingCanvas" xmlns:cx="http://schemas.microsoft.com/office/drawing/2014/chartex" xmlns:cx1="http://schemas.microsoft.com/office/drawing/2015/9/8/chartex" xmlns:cx2="http://schemas.microsoft.com/office/drawing/2015/10/21/chartex" xmlns:cx3="http://schemas.microsoft.com/office/drawing/2016/5/9/chartex" xmlns:cx4="http://schemas.microsoft.com/office/drawing/2016/5/10/chartex" xmlns:cx5="http://schemas.microsoft.com/office/drawing/2016/5/11/chartex" xmlns:cx6="http://schemas.microsoft.com/office/drawing/2016/5/12/chartex" xmlns:cx7="http://schemas.microsoft.com/office/drawing/2016/5/13/chartex" xmlns:cx8="http://schemas.microsoft.com/office/drawing/2016/5/14/chartex" xmlns:mc="http://schemas.openxmlformats.org/markup-compatibility/2006" xmlns:aink="http://schemas.microsoft.com/office/drawing/2016/ink" xmlns:am3d="http://schemas.microsoft.com/office/drawing/2017/model3d" xmlns:o="urn:schemas-microsoft-com:office:office" xmlns:oel="http://schemas.microsoft.com/office/2019/extlst" xmlns:r="http://schemas.openxmlformats.org/officeDocument/2006/relationships" xmlns:m="http://schemas.openxmlformats.org/officeDocument/2006/math" xmlns:v="urn:schemas-microsoft-com:vml" xmlns:wp14="http://schemas.microsoft.com/office/word/2010/wordprocessingDrawing" xmlns:wp="http://schemas.openxmlformats.org/drawingml/2006/wordprocessingDrawing" xmlns:w10="urn:schemas-microsoft-com:office:word" xmlns:w="http://schemas.openxmlformats.org/wordprocessingml/2006/main" xmlns:w14="http://schemas.microsoft.com/office/word/2010/wordml" xmlns:w15="http://schemas.microsoft.com/office/word/2012/wordml" xmlns:w16cex="http://schemas.microsoft.com/office/word/2018/wordml/cex" xmlns:w16cid="http://schemas.microsoft.com/office/word/2016/wordml/cid" xmlns:w16="http://schemas.microsoft.com/office/word/2018/wordml" xmlns:w16du="http://schemas.microsoft.com/office/word/2023/wordml/word16du" xmlns:w16sdtdh="http://schemas.microsoft.com/office/word/2020/wordml/sdtdatahash" xmlns:w16sdtfl="http://schemas.microsoft.com/office/word/2024/wordml/sdtformatlock" xmlns:w16se="http://schemas.microsoft.com/office/word/2015/wordml/symex" xmlns:wpg="http://schemas.microsoft.com/office/word/2010/wordprocessingGroup" xmlns:wpi="http://schemas.microsoft.com/office/word/2010/wordprocessingInk" xmlns:wne="http://schemas.microsoft.com/office/word/2006/wordml" xmlns:wps="http://schemas.microsoft.com/office/word/2010/wordprocessingShape" mc:Ignorable="w14 w15 w16se w16cid w16 w16cex w16sdtdh w16sdtfl w16du wp14">
+<w:numbering xmlns:wpc="http://schemas.microsoft.com/office/word/2010/wordprocessingCanvas" xmlns:cx="http://schemas.microsoft.com/office/drawing/2014/chartex" xmlns:mc="http://schemas.openxmlformats.org/markup-compatibility/2006" xmlns:o="urn:schemas-microsoft-com:office:office" xmlns:r="http://schemas.openxmlformats.org/officeDocument/2006/relationships" xmlns:m="http://schemas.openxmlformats.org/officeDocument/2006/math" xmlns:v="urn:schemas-microsoft-com:vml" xmlns:wp14="http://schemas.microsoft.com/office/word/2010/wordprocessingDrawing" xmlns:wp="http://schemas.openxmlformats.org/drawingml/2006/wordprocessingDrawing" xmlns:w10="urn:schemas-microsoft-com:office:word" xmlns:w="http://schemas.openxmlformats.org/wordprocessingml/2006/main" xmlns:w14="http://schemas.microsoft.com/office/word/2010/wordml" xmlns:w15="http://schemas.microsoft.com/office/word/2012/wordml" xmlns:w16se="http://schemas.microsoft.com/office/word/2015/wordml/symex" xmlns:wpg="http://schemas.microsoft.com/office/word/2010/wordprocessingGroup" xmlns:wpi="http://schemas.microsoft.com/office/word/2010/wordprocessingInk" xmlns:wne="http://schemas.microsoft.com/office/word/2006/wordml" xmlns:wps="http://schemas.microsoft.com/office/word/2010/wordprocessingShape" mc:Ignorable="w14 w15 w16se wp14">
   <w:abstractNum w:abstractNumId="0" w15:restartNumberingAfterBreak="0">
     <w:nsid w:val="18047FEF"/>
     <w:multiLevelType w:val="hybridMultilevel"/>
@@ -9402,47 +9355,47 @@
       </w:pPr>
     </w:lvl>
   </w:abstractNum>
-  <w:num w:numId="1" w16cid:durableId="1188249411">
+  <w:num w:numId="1">
     <w:abstractNumId w:val="6"/>
   </w:num>
-  <w:num w:numId="2" w16cid:durableId="1135022078">
+  <w:num w:numId="2">
     <w:abstractNumId w:val="3"/>
   </w:num>
-  <w:num w:numId="3" w16cid:durableId="769393217">
+  <w:num w:numId="3">
     <w:abstractNumId w:val="9"/>
   </w:num>
-  <w:num w:numId="4" w16cid:durableId="1479224080">
+  <w:num w:numId="4">
     <w:abstractNumId w:val="5"/>
   </w:num>
-  <w:num w:numId="5" w16cid:durableId="748620517">
+  <w:num w:numId="5">
     <w:abstractNumId w:val="7"/>
   </w:num>
-  <w:num w:numId="6" w16cid:durableId="842479120">
+  <w:num w:numId="6">
     <w:abstractNumId w:val="8"/>
   </w:num>
-  <w:num w:numId="7" w16cid:durableId="1507163118">
+  <w:num w:numId="7">
     <w:abstractNumId w:val="1"/>
   </w:num>
-  <w:num w:numId="8" w16cid:durableId="326515975">
+  <w:num w:numId="8">
     <w:abstractNumId w:val="4"/>
   </w:num>
-  <w:num w:numId="9" w16cid:durableId="566722078">
+  <w:num w:numId="9">
     <w:abstractNumId w:val="11"/>
   </w:num>
-  <w:num w:numId="10" w16cid:durableId="1008752826">
+  <w:num w:numId="10">
     <w:abstractNumId w:val="0"/>
   </w:num>
-  <w:num w:numId="11" w16cid:durableId="2004622395">
+  <w:num w:numId="11">
     <w:abstractNumId w:val="2"/>
   </w:num>
-  <w:num w:numId="12" w16cid:durableId="1509637496">
+  <w:num w:numId="12">
     <w:abstractNumId w:val="10"/>
   </w:num>
 </w:numbering>
 </file>
 
 <file path=word/people.xml><?xml version="1.0" encoding="utf-8"?>
-<w15:people xmlns:wpc="http://schemas.microsoft.com/office/word/2010/wordprocessingCanvas" xmlns:cx="http://schemas.microsoft.com/office/drawing/2014/chartex" xmlns:cx1="http://schemas.microsoft.com/office/drawing/2015/9/8/chartex" xmlns:cx2="http://schemas.microsoft.com/office/drawing/2015/10/21/chartex" xmlns:cx3="http://schemas.microsoft.com/office/drawing/2016/5/9/chartex" xmlns:cx4="http://schemas.microsoft.com/office/drawing/2016/5/10/chartex" xmlns:cx5="http://schemas.microsoft.com/office/drawing/2016/5/11/chartex" xmlns:cx6="http://schemas.microsoft.com/office/drawing/2016/5/12/chartex" xmlns:cx7="http://schemas.microsoft.com/office/drawing/2016/5/13/chartex" xmlns:cx8="http://schemas.microsoft.com/office/drawing/2016/5/14/chartex" xmlns:mc="http://schemas.openxmlformats.org/markup-compatibility/2006" xmlns:aink="http://schemas.microsoft.com/office/drawing/2016/ink" xmlns:am3d="http://schemas.microsoft.com/office/drawing/2017/model3d" xmlns:o="urn:schemas-microsoft-com:office:office" xmlns:oel="http://schemas.microsoft.com/office/2019/extlst" xmlns:r="http://schemas.openxmlformats.org/officeDocument/2006/relationships" xmlns:m="http://schemas.openxmlformats.org/officeDocument/2006/math" xmlns:v="urn:schemas-microsoft-com:vml" xmlns:wp14="http://schemas.microsoft.com/office/word/2010/wordprocessingDrawing" xmlns:wp="http://schemas.openxmlformats.org/drawingml/2006/wordprocessingDrawing" xmlns:w10="urn:schemas-microsoft-com:office:word" xmlns:w="http://schemas.openxmlformats.org/wordprocessingml/2006/main" xmlns:w14="http://schemas.microsoft.com/office/word/2010/wordml" xmlns:w15="http://schemas.microsoft.com/office/word/2012/wordml" xmlns:w16cex="http://schemas.microsoft.com/office/word/2018/wordml/cex" xmlns:w16cid="http://schemas.microsoft.com/office/word/2016/wordml/cid" xmlns:w16="http://schemas.microsoft.com/office/word/2018/wordml" xmlns:w16du="http://schemas.microsoft.com/office/word/2023/wordml/word16du" xmlns:w16sdtdh="http://schemas.microsoft.com/office/word/2020/wordml/sdtdatahash" xmlns:w16sdtfl="http://schemas.microsoft.com/office/word/2024/wordml/sdtformatlock" xmlns:w16se="http://schemas.microsoft.com/office/word/2015/wordml/symex" xmlns:wpg="http://schemas.microsoft.com/office/word/2010/wordprocessingGroup" xmlns:wpi="http://schemas.microsoft.com/office/word/2010/wordprocessingInk" xmlns:wne="http://schemas.microsoft.com/office/word/2006/wordml" xmlns:wps="http://schemas.microsoft.com/office/word/2010/wordprocessingShape" mc:Ignorable="w14 w15 w16se w16cid w16 w16cex w16sdtdh w16sdtfl w16du wp14">
+<w15:people xmlns:wpc="http://schemas.microsoft.com/office/word/2010/wordprocessingCanvas" xmlns:cx="http://schemas.microsoft.com/office/drawing/2014/chartex" xmlns:mc="http://schemas.openxmlformats.org/markup-compatibility/2006" xmlns:o="urn:schemas-microsoft-com:office:office" xmlns:r="http://schemas.openxmlformats.org/officeDocument/2006/relationships" xmlns:m="http://schemas.openxmlformats.org/officeDocument/2006/math" xmlns:v="urn:schemas-microsoft-com:vml" xmlns:wp14="http://schemas.microsoft.com/office/word/2010/wordprocessingDrawing" xmlns:wp="http://schemas.openxmlformats.org/drawingml/2006/wordprocessingDrawing" xmlns:w10="urn:schemas-microsoft-com:office:word" xmlns:w="http://schemas.openxmlformats.org/wordprocessingml/2006/main" xmlns:w14="http://schemas.microsoft.com/office/word/2010/wordml" xmlns:w15="http://schemas.microsoft.com/office/word/2012/wordml" xmlns:w16se="http://schemas.microsoft.com/office/word/2015/wordml/symex" xmlns:wpg="http://schemas.microsoft.com/office/word/2010/wordprocessingGroup" xmlns:wpi="http://schemas.microsoft.com/office/word/2010/wordprocessingInk" xmlns:wne="http://schemas.microsoft.com/office/word/2006/wordml" xmlns:wps="http://schemas.microsoft.com/office/word/2010/wordprocessingShape" mc:Ignorable="w14 w15 w16se wp14">
   <w15:person w15:author="Ing Angelo Rodriguez">
     <w15:presenceInfo w15:providerId="Windows Live" w15:userId="b836b97e9e46a9c9"/>
   </w15:person>
@@ -9450,7 +9403,7 @@
 </file>
 
 <file path=word/styles.xml><?xml version="1.0" encoding="utf-8"?>
-<w:styles xmlns:mc="http://schemas.openxmlformats.org/markup-compatibility/2006" xmlns:r="http://schemas.openxmlformats.org/officeDocument/2006/relationships" xmlns:w="http://schemas.openxmlformats.org/wordprocessingml/2006/main" xmlns:w14="http://schemas.microsoft.com/office/word/2010/wordml" xmlns:w15="http://schemas.microsoft.com/office/word/2012/wordml" xmlns:w16cex="http://schemas.microsoft.com/office/word/2018/wordml/cex" xmlns:w16cid="http://schemas.microsoft.com/office/word/2016/wordml/cid" xmlns:w16="http://schemas.microsoft.com/office/word/2018/wordml" xmlns:w16du="http://schemas.microsoft.com/office/word/2023/wordml/word16du" xmlns:w16sdtdh="http://schemas.microsoft.com/office/word/2020/wordml/sdtdatahash" xmlns:w16sdtfl="http://schemas.microsoft.com/office/word/2024/wordml/sdtformatlock" xmlns:w16se="http://schemas.microsoft.com/office/word/2015/wordml/symex" mc:Ignorable="w14 w15 w16se w16cid w16 w16cex w16sdtdh w16sdtfl w16du">
+<w:styles xmlns:mc="http://schemas.openxmlformats.org/markup-compatibility/2006" xmlns:r="http://schemas.openxmlformats.org/officeDocument/2006/relationships" xmlns:w="http://schemas.openxmlformats.org/wordprocessingml/2006/main" xmlns:w14="http://schemas.microsoft.com/office/word/2010/wordml" xmlns:w15="http://schemas.microsoft.com/office/word/2012/wordml" xmlns:w16se="http://schemas.microsoft.com/office/word/2015/wordml/symex" mc:Ignorable="w14 w15 w16se">
   <w:docDefaults>
     <w:rPrDefault>
       <w:rPr>
@@ -9466,7 +9419,7 @@
       </w:pPr>
     </w:pPrDefault>
   </w:docDefaults>
-  <w:latentStyles w:defLockedState="0" w:defUIPriority="99" w:defSemiHidden="0" w:defUnhideWhenUsed="0" w:defQFormat="0" w:count="376">
+  <w:latentStyles w:defLockedState="0" w:defUIPriority="99" w:defSemiHidden="0" w:defUnhideWhenUsed="0" w:defQFormat="0" w:count="371">
     <w:lsdException w:name="Normal" w:uiPriority="0" w:qFormat="1"/>
     <w:lsdException w:name="heading 1" w:uiPriority="9" w:qFormat="1"/>
     <w:lsdException w:name="heading 2" w:semiHidden="1" w:uiPriority="9" w:unhideWhenUsed="1" w:qFormat="1"/>
@@ -9838,11 +9791,6 @@
     <w:lsdException w:name="List Table 5 Dark Accent 6" w:uiPriority="50"/>
     <w:lsdException w:name="List Table 6 Colorful Accent 6" w:uiPriority="51"/>
     <w:lsdException w:name="List Table 7 Colorful Accent 6" w:uiPriority="52"/>
-    <w:lsdException w:name="Mention" w:semiHidden="1" w:unhideWhenUsed="1"/>
-    <w:lsdException w:name="Smart Hyperlink" w:semiHidden="1" w:unhideWhenUsed="1"/>
-    <w:lsdException w:name="Hashtag" w:semiHidden="1" w:unhideWhenUsed="1"/>
-    <w:lsdException w:name="Unresolved Mention" w:semiHidden="1" w:unhideWhenUsed="1"/>
-    <w:lsdException w:name="Smart Link" w:semiHidden="1" w:unhideWhenUsed="1"/>
   </w:latentStyles>
   <w:style w:type="paragraph" w:default="1" w:styleId="Normal">
     <w:name w:val="Normal"/>
@@ -9852,6 +9800,7 @@
   <w:style w:type="character" w:default="1" w:styleId="Fuentedeprrafopredeter">
     <w:name w:val="Default Paragraph Font"/>
     <w:uiPriority w:val="1"/>
+    <w:semiHidden/>
     <w:unhideWhenUsed/>
   </w:style>
   <w:style w:type="table" w:default="1" w:styleId="Tablanormal">
@@ -10173,7 +10122,7 @@
       <w:szCs w:val="18"/>
     </w:rPr>
   </w:style>
-  <w:style w:type="character" w:styleId="Mencinsinresolver">
+  <w:style w:type="character" w:customStyle="1" w:styleId="UnresolvedMention">
     <w:name w:val="Unresolved Mention"/>
     <w:basedOn w:val="Fuentedeprrafopredeter"/>
     <w:uiPriority w:val="99"/>
@@ -11413,6 +11362,13 @@
         </dgm:presLayoutVars>
       </dgm:prSet>
       <dgm:spPr/>
+      <dgm:t>
+        <a:bodyPr/>
+        <a:lstStyle/>
+        <a:p>
+          <a:endParaRPr lang="es-ES"/>
+        </a:p>
+      </dgm:t>
     </dgm:pt>
     <dgm:pt modelId="{E9C15D92-DC6A-4A1E-8100-5F3AFFA44721}" type="pres">
       <dgm:prSet presAssocID="{9E1B371D-F429-4C1A-9057-85DC424AB51B}" presName="hierFlow" presStyleCnt="0"/>
@@ -11439,6 +11395,13 @@
         </dgm:presLayoutVars>
       </dgm:prSet>
       <dgm:spPr/>
+      <dgm:t>
+        <a:bodyPr/>
+        <a:lstStyle/>
+        <a:p>
+          <a:endParaRPr lang="es-ES"/>
+        </a:p>
+      </dgm:t>
     </dgm:pt>
     <dgm:pt modelId="{BDFF5D21-D949-4A5A-A730-B30A95550CF4}" type="pres">
       <dgm:prSet presAssocID="{A4EEFC09-29A6-4AC9-ADD6-6E3D00B689FE}" presName="hierChild2" presStyleCnt="0"/>
@@ -11447,6 +11410,13 @@
     <dgm:pt modelId="{21176C0B-04F4-4443-8A1A-108B7D8E57A3}" type="pres">
       <dgm:prSet presAssocID="{338DD030-9382-4C21-965C-562BCBBF31B6}" presName="Name19" presStyleLbl="parChTrans1D2" presStyleIdx="0" presStyleCnt="2"/>
       <dgm:spPr/>
+      <dgm:t>
+        <a:bodyPr/>
+        <a:lstStyle/>
+        <a:p>
+          <a:endParaRPr lang="es-ES"/>
+        </a:p>
+      </dgm:t>
     </dgm:pt>
     <dgm:pt modelId="{13A30FED-D1CD-4CE3-9EB2-0DEFFB64C8EB}" type="pres">
       <dgm:prSet presAssocID="{0CF50144-2FF4-40C4-9316-30D6C100994A}" presName="Name21" presStyleCnt="0"/>
@@ -11455,6 +11425,13 @@
     <dgm:pt modelId="{6C91BB51-8AD0-45C1-8B0F-C24C897FB0E9}" type="pres">
       <dgm:prSet presAssocID="{0CF50144-2FF4-40C4-9316-30D6C100994A}" presName="level2Shape" presStyleLbl="node2" presStyleIdx="0" presStyleCnt="2"/>
       <dgm:spPr/>
+      <dgm:t>
+        <a:bodyPr/>
+        <a:lstStyle/>
+        <a:p>
+          <a:endParaRPr lang="es-ES"/>
+        </a:p>
+      </dgm:t>
     </dgm:pt>
     <dgm:pt modelId="{80D6BEFD-8D51-484D-B7E0-D200EC7EDFC6}" type="pres">
       <dgm:prSet presAssocID="{0CF50144-2FF4-40C4-9316-30D6C100994A}" presName="hierChild3" presStyleCnt="0"/>
@@ -11463,6 +11440,13 @@
     <dgm:pt modelId="{0562419B-F5A3-4FA6-8622-8162CA041F03}" type="pres">
       <dgm:prSet presAssocID="{B7AA7E8A-A8E7-4385-BC02-322C7D14A4D6}" presName="Name19" presStyleLbl="parChTrans1D3" presStyleIdx="0" presStyleCnt="3"/>
       <dgm:spPr/>
+      <dgm:t>
+        <a:bodyPr/>
+        <a:lstStyle/>
+        <a:p>
+          <a:endParaRPr lang="es-ES"/>
+        </a:p>
+      </dgm:t>
     </dgm:pt>
     <dgm:pt modelId="{A40F1144-CD71-4322-8702-A480EB995B5A}" type="pres">
       <dgm:prSet presAssocID="{831A1F8D-6ECE-47EB-A35F-C3216108ECB2}" presName="Name21" presStyleCnt="0"/>
@@ -11471,6 +11455,13 @@
     <dgm:pt modelId="{32BB8D11-D35B-4C56-9D73-ECBD62ACBB11}" type="pres">
       <dgm:prSet presAssocID="{831A1F8D-6ECE-47EB-A35F-C3216108ECB2}" presName="level2Shape" presStyleLbl="node3" presStyleIdx="0" presStyleCnt="3"/>
       <dgm:spPr/>
+      <dgm:t>
+        <a:bodyPr/>
+        <a:lstStyle/>
+        <a:p>
+          <a:endParaRPr lang="es-ES"/>
+        </a:p>
+      </dgm:t>
     </dgm:pt>
     <dgm:pt modelId="{5F57A617-1797-414B-8E61-B0A6325F3979}" type="pres">
       <dgm:prSet presAssocID="{831A1F8D-6ECE-47EB-A35F-C3216108ECB2}" presName="hierChild3" presStyleCnt="0"/>
@@ -11479,6 +11470,13 @@
     <dgm:pt modelId="{A886ECB0-9441-4696-BF52-7A5C777A2814}" type="pres">
       <dgm:prSet presAssocID="{BEE919CC-B3F4-4B79-B286-D745FE4D6131}" presName="Name19" presStyleLbl="parChTrans1D4" presStyleIdx="0" presStyleCnt="3"/>
       <dgm:spPr/>
+      <dgm:t>
+        <a:bodyPr/>
+        <a:lstStyle/>
+        <a:p>
+          <a:endParaRPr lang="es-ES"/>
+        </a:p>
+      </dgm:t>
     </dgm:pt>
     <dgm:pt modelId="{ED3B9255-68AC-421C-A73E-C6C7FEF9529F}" type="pres">
       <dgm:prSet presAssocID="{E3EDC961-6E8D-4FA7-ADEF-1EBA9FE42A78}" presName="Name21" presStyleCnt="0"/>
@@ -11487,6 +11485,13 @@
     <dgm:pt modelId="{26CAE976-1479-4F47-8C45-4AA541B30ACA}" type="pres">
       <dgm:prSet presAssocID="{E3EDC961-6E8D-4FA7-ADEF-1EBA9FE42A78}" presName="level2Shape" presStyleLbl="node4" presStyleIdx="0" presStyleCnt="3"/>
       <dgm:spPr/>
+      <dgm:t>
+        <a:bodyPr/>
+        <a:lstStyle/>
+        <a:p>
+          <a:endParaRPr lang="es-ES"/>
+        </a:p>
+      </dgm:t>
     </dgm:pt>
     <dgm:pt modelId="{4F0A74D8-CB7D-4B92-B527-EE852FE0BDB3}" type="pres">
       <dgm:prSet presAssocID="{E3EDC961-6E8D-4FA7-ADEF-1EBA9FE42A78}" presName="hierChild3" presStyleCnt="0"/>
@@ -11495,6 +11500,13 @@
     <dgm:pt modelId="{91278B1F-8C76-44BE-8617-567D87E5D98A}" type="pres">
       <dgm:prSet presAssocID="{928BC48A-0622-4B0F-87BA-5C2E3F92BFA8}" presName="Name19" presStyleLbl="parChTrans1D4" presStyleIdx="1" presStyleCnt="3"/>
       <dgm:spPr/>
+      <dgm:t>
+        <a:bodyPr/>
+        <a:lstStyle/>
+        <a:p>
+          <a:endParaRPr lang="es-ES"/>
+        </a:p>
+      </dgm:t>
     </dgm:pt>
     <dgm:pt modelId="{016EC404-E86A-49A9-AF15-39F6BDD7E60A}" type="pres">
       <dgm:prSet presAssocID="{315E5632-9778-42FD-B65A-9F376649F93B}" presName="Name21" presStyleCnt="0"/>
@@ -11503,6 +11515,13 @@
     <dgm:pt modelId="{DB315337-C2F8-4A95-8AC6-3FC96AE3D762}" type="pres">
       <dgm:prSet presAssocID="{315E5632-9778-42FD-B65A-9F376649F93B}" presName="level2Shape" presStyleLbl="node4" presStyleIdx="1" presStyleCnt="3"/>
       <dgm:spPr/>
+      <dgm:t>
+        <a:bodyPr/>
+        <a:lstStyle/>
+        <a:p>
+          <a:endParaRPr lang="es-ES"/>
+        </a:p>
+      </dgm:t>
     </dgm:pt>
     <dgm:pt modelId="{E5F1B291-D69E-4806-BF46-6FA0BFE23882}" type="pres">
       <dgm:prSet presAssocID="{315E5632-9778-42FD-B65A-9F376649F93B}" presName="hierChild3" presStyleCnt="0"/>
@@ -11511,6 +11530,13 @@
     <dgm:pt modelId="{9BF356A3-130D-49F0-ACC3-4EEB54B01D4B}" type="pres">
       <dgm:prSet presAssocID="{ACF4D7C5-E61D-40D1-857C-DE53439FC1C3}" presName="Name19" presStyleLbl="parChTrans1D3" presStyleIdx="1" presStyleCnt="3"/>
       <dgm:spPr/>
+      <dgm:t>
+        <a:bodyPr/>
+        <a:lstStyle/>
+        <a:p>
+          <a:endParaRPr lang="es-ES"/>
+        </a:p>
+      </dgm:t>
     </dgm:pt>
     <dgm:pt modelId="{5E427A5F-17C6-4812-97EC-DEF81F7BFC92}" type="pres">
       <dgm:prSet presAssocID="{43C52038-84AF-49A2-A6AA-3A9D02B1C9C4}" presName="Name21" presStyleCnt="0"/>
@@ -11519,6 +11545,13 @@
     <dgm:pt modelId="{E2DBD94E-B76B-4C03-A995-2549099419F4}" type="pres">
       <dgm:prSet presAssocID="{43C52038-84AF-49A2-A6AA-3A9D02B1C9C4}" presName="level2Shape" presStyleLbl="node3" presStyleIdx="1" presStyleCnt="3"/>
       <dgm:spPr/>
+      <dgm:t>
+        <a:bodyPr/>
+        <a:lstStyle/>
+        <a:p>
+          <a:endParaRPr lang="es-ES"/>
+        </a:p>
+      </dgm:t>
     </dgm:pt>
     <dgm:pt modelId="{51B279E4-DB9F-4C1A-9363-4D1F258D05F9}" type="pres">
       <dgm:prSet presAssocID="{43C52038-84AF-49A2-A6AA-3A9D02B1C9C4}" presName="hierChild3" presStyleCnt="0"/>
@@ -11527,6 +11560,13 @@
     <dgm:pt modelId="{603A8723-F6F5-4F87-82C3-B792E1F96C9D}" type="pres">
       <dgm:prSet presAssocID="{B5D13530-A86C-4AE9-AA52-B5AE819C75F8}" presName="Name19" presStyleLbl="parChTrans1D2" presStyleIdx="1" presStyleCnt="2"/>
       <dgm:spPr/>
+      <dgm:t>
+        <a:bodyPr/>
+        <a:lstStyle/>
+        <a:p>
+          <a:endParaRPr lang="es-ES"/>
+        </a:p>
+      </dgm:t>
     </dgm:pt>
     <dgm:pt modelId="{4B0A33A2-F223-4A75-A279-89C56B4EBB9D}" type="pres">
       <dgm:prSet presAssocID="{DC87C6F7-2230-4616-A048-B52CF746B139}" presName="Name21" presStyleCnt="0"/>
@@ -11535,6 +11575,13 @@
     <dgm:pt modelId="{027F0FDB-893C-4ACE-A280-DB8972739F7A}" type="pres">
       <dgm:prSet presAssocID="{DC87C6F7-2230-4616-A048-B52CF746B139}" presName="level2Shape" presStyleLbl="node2" presStyleIdx="1" presStyleCnt="2"/>
       <dgm:spPr/>
+      <dgm:t>
+        <a:bodyPr/>
+        <a:lstStyle/>
+        <a:p>
+          <a:endParaRPr lang="es-ES"/>
+        </a:p>
+      </dgm:t>
     </dgm:pt>
     <dgm:pt modelId="{57071BD2-17A5-4AE2-9C7C-6D9885808C97}" type="pres">
       <dgm:prSet presAssocID="{DC87C6F7-2230-4616-A048-B52CF746B139}" presName="hierChild3" presStyleCnt="0"/>
@@ -11543,6 +11590,13 @@
     <dgm:pt modelId="{B441FB95-FAC5-4341-9531-6EE991D19304}" type="pres">
       <dgm:prSet presAssocID="{7AAABFDD-135C-49A7-B551-53F32CF5EF27}" presName="Name19" presStyleLbl="parChTrans1D3" presStyleIdx="2" presStyleCnt="3"/>
       <dgm:spPr/>
+      <dgm:t>
+        <a:bodyPr/>
+        <a:lstStyle/>
+        <a:p>
+          <a:endParaRPr lang="es-ES"/>
+        </a:p>
+      </dgm:t>
     </dgm:pt>
     <dgm:pt modelId="{09BDA1EF-A87D-439E-9C96-1CED11DC75D5}" type="pres">
       <dgm:prSet presAssocID="{3E7FC8A0-0A09-4769-9A8D-ACDE06C6FB1D}" presName="Name21" presStyleCnt="0"/>
@@ -11551,6 +11605,13 @@
     <dgm:pt modelId="{0946F033-8450-4E70-9B4B-334353E0F312}" type="pres">
       <dgm:prSet presAssocID="{3E7FC8A0-0A09-4769-9A8D-ACDE06C6FB1D}" presName="level2Shape" presStyleLbl="node3" presStyleIdx="2" presStyleCnt="3"/>
       <dgm:spPr/>
+      <dgm:t>
+        <a:bodyPr/>
+        <a:lstStyle/>
+        <a:p>
+          <a:endParaRPr lang="es-ES"/>
+        </a:p>
+      </dgm:t>
     </dgm:pt>
     <dgm:pt modelId="{63A34E25-4F1A-4F33-B94E-B03C41E48B0F}" type="pres">
       <dgm:prSet presAssocID="{3E7FC8A0-0A09-4769-9A8D-ACDE06C6FB1D}" presName="hierChild3" presStyleCnt="0"/>
@@ -11559,6 +11620,13 @@
     <dgm:pt modelId="{F14626FE-E07A-4414-897B-524D2848A3D9}" type="pres">
       <dgm:prSet presAssocID="{7CAF6B4D-78FE-441C-B541-9F8F4569118D}" presName="Name19" presStyleLbl="parChTrans1D4" presStyleIdx="2" presStyleCnt="3"/>
       <dgm:spPr/>
+      <dgm:t>
+        <a:bodyPr/>
+        <a:lstStyle/>
+        <a:p>
+          <a:endParaRPr lang="es-ES"/>
+        </a:p>
+      </dgm:t>
     </dgm:pt>
     <dgm:pt modelId="{263D050E-1163-4D11-8073-7FB998C4AD5A}" type="pres">
       <dgm:prSet presAssocID="{4DD8320B-72A3-4376-937B-1312ABE3D389}" presName="Name21" presStyleCnt="0"/>
@@ -11567,6 +11635,13 @@
     <dgm:pt modelId="{B8D195D4-2F3F-4033-88EF-FAAA2C4574AB}" type="pres">
       <dgm:prSet presAssocID="{4DD8320B-72A3-4376-937B-1312ABE3D389}" presName="level2Shape" presStyleLbl="node4" presStyleIdx="2" presStyleCnt="3"/>
       <dgm:spPr/>
+      <dgm:t>
+        <a:bodyPr/>
+        <a:lstStyle/>
+        <a:p>
+          <a:endParaRPr lang="es-ES"/>
+        </a:p>
+      </dgm:t>
     </dgm:pt>
     <dgm:pt modelId="{7E96B940-00C6-4767-B02C-0D25BA9DDF2A}" type="pres">
       <dgm:prSet presAssocID="{4DD8320B-72A3-4376-937B-1312ABE3D389}" presName="hierChild3" presStyleCnt="0"/>
@@ -11578,33 +11653,33 @@
     </dgm:pt>
   </dgm:ptLst>
   <dgm:cxnLst>
+    <dgm:cxn modelId="{CE458EC7-03AB-4C64-A13D-B401A8E6059D}" type="presOf" srcId="{338DD030-9382-4C21-965C-562BCBBF31B6}" destId="{21176C0B-04F4-4443-8A1A-108B7D8E57A3}" srcOrd="0" destOrd="0" presId="urn:microsoft.com/office/officeart/2005/8/layout/hierarchy6"/>
+    <dgm:cxn modelId="{6A8B90A6-E750-4EDD-B3EE-B7FD694DF2BF}" srcId="{9E1B371D-F429-4C1A-9057-85DC424AB51B}" destId="{A4EEFC09-29A6-4AC9-ADD6-6E3D00B689FE}" srcOrd="0" destOrd="0" parTransId="{E292016E-A8B3-4161-BE3A-BC1D6B7A3C9F}" sibTransId="{9B43239C-99E6-4440-83C6-2206D2524D4F}"/>
+    <dgm:cxn modelId="{AEEFC1D1-6BA4-40A2-B8F6-978A97450798}" type="presOf" srcId="{B5D13530-A86C-4AE9-AA52-B5AE819C75F8}" destId="{603A8723-F6F5-4F87-82C3-B792E1F96C9D}" srcOrd="0" destOrd="0" presId="urn:microsoft.com/office/officeart/2005/8/layout/hierarchy6"/>
+    <dgm:cxn modelId="{992808B9-4256-4FEB-A303-99E48DC2BCE7}" type="presOf" srcId="{DC87C6F7-2230-4616-A048-B52CF746B139}" destId="{027F0FDB-893C-4ACE-A280-DB8972739F7A}" srcOrd="0" destOrd="0" presId="urn:microsoft.com/office/officeart/2005/8/layout/hierarchy6"/>
+    <dgm:cxn modelId="{7FD6BCB0-2A88-4BDF-8B9E-AED86D64FD49}" type="presOf" srcId="{4DD8320B-72A3-4376-937B-1312ABE3D389}" destId="{B8D195D4-2F3F-4033-88EF-FAAA2C4574AB}" srcOrd="0" destOrd="0" presId="urn:microsoft.com/office/officeart/2005/8/layout/hierarchy6"/>
+    <dgm:cxn modelId="{99F70C22-CB14-44BD-A847-8CD60AAB69CD}" type="presOf" srcId="{A4EEFC09-29A6-4AC9-ADD6-6E3D00B689FE}" destId="{D640BE23-B8E5-4937-A364-140053DD9DA0}" srcOrd="0" destOrd="0" presId="urn:microsoft.com/office/officeart/2005/8/layout/hierarchy6"/>
+    <dgm:cxn modelId="{D40F07DF-E9C0-48B1-AB1A-AE943E30A99A}" type="presOf" srcId="{3E7FC8A0-0A09-4769-9A8D-ACDE06C6FB1D}" destId="{0946F033-8450-4E70-9B4B-334353E0F312}" srcOrd="0" destOrd="0" presId="urn:microsoft.com/office/officeart/2005/8/layout/hierarchy6"/>
+    <dgm:cxn modelId="{20D0F089-DF93-4C3D-AA58-973644F8B452}" srcId="{831A1F8D-6ECE-47EB-A35F-C3216108ECB2}" destId="{315E5632-9778-42FD-B65A-9F376649F93B}" srcOrd="1" destOrd="0" parTransId="{928BC48A-0622-4B0F-87BA-5C2E3F92BFA8}" sibTransId="{1F26003D-A9C6-4588-BD6D-4B4FB4422A8C}"/>
+    <dgm:cxn modelId="{31DD5D6C-DD02-435A-BCDF-1C4650DD5673}" type="presOf" srcId="{0CF50144-2FF4-40C4-9316-30D6C100994A}" destId="{6C91BB51-8AD0-45C1-8B0F-C24C897FB0E9}" srcOrd="0" destOrd="0" presId="urn:microsoft.com/office/officeart/2005/8/layout/hierarchy6"/>
+    <dgm:cxn modelId="{DE1E6C0F-6AE4-4C0B-AB3C-86693E54B0CD}" type="presOf" srcId="{831A1F8D-6ECE-47EB-A35F-C3216108ECB2}" destId="{32BB8D11-D35B-4C56-9D73-ECBD62ACBB11}" srcOrd="0" destOrd="0" presId="urn:microsoft.com/office/officeart/2005/8/layout/hierarchy6"/>
+    <dgm:cxn modelId="{04454BBC-AA90-4127-93FE-D07929768187}" srcId="{A4EEFC09-29A6-4AC9-ADD6-6E3D00B689FE}" destId="{DC87C6F7-2230-4616-A048-B52CF746B139}" srcOrd="1" destOrd="0" parTransId="{B5D13530-A86C-4AE9-AA52-B5AE819C75F8}" sibTransId="{380E520D-076D-4816-901E-3434A1B7611E}"/>
+    <dgm:cxn modelId="{48A71695-3FF7-4EE3-A651-6CCA9B586465}" type="presOf" srcId="{ACF4D7C5-E61D-40D1-857C-DE53439FC1C3}" destId="{9BF356A3-130D-49F0-ACC3-4EEB54B01D4B}" srcOrd="0" destOrd="0" presId="urn:microsoft.com/office/officeart/2005/8/layout/hierarchy6"/>
+    <dgm:cxn modelId="{E1B56650-C459-427B-9DFC-495ACAFE7008}" type="presOf" srcId="{928BC48A-0622-4B0F-87BA-5C2E3F92BFA8}" destId="{91278B1F-8C76-44BE-8617-567D87E5D98A}" srcOrd="0" destOrd="0" presId="urn:microsoft.com/office/officeart/2005/8/layout/hierarchy6"/>
+    <dgm:cxn modelId="{CFCE7CB3-F1F0-4727-AE54-06A085F7E8CA}" srcId="{831A1F8D-6ECE-47EB-A35F-C3216108ECB2}" destId="{E3EDC961-6E8D-4FA7-ADEF-1EBA9FE42A78}" srcOrd="0" destOrd="0" parTransId="{BEE919CC-B3F4-4B79-B286-D745FE4D6131}" sibTransId="{C92D9BE3-3FA2-4A79-90B5-CCBC5D292E90}"/>
+    <dgm:cxn modelId="{16C5F3D3-BE64-4D85-9D91-63233FD458D0}" type="presOf" srcId="{BEE919CC-B3F4-4B79-B286-D745FE4D6131}" destId="{A886ECB0-9441-4696-BF52-7A5C777A2814}" srcOrd="0" destOrd="0" presId="urn:microsoft.com/office/officeart/2005/8/layout/hierarchy6"/>
+    <dgm:cxn modelId="{8E708819-54DC-4E5D-B49D-966BCF0105D7}" srcId="{DC87C6F7-2230-4616-A048-B52CF746B139}" destId="{3E7FC8A0-0A09-4769-9A8D-ACDE06C6FB1D}" srcOrd="0" destOrd="0" parTransId="{7AAABFDD-135C-49A7-B551-53F32CF5EF27}" sibTransId="{348A8937-DE76-4DB7-AE03-B69CB190C1BC}"/>
     <dgm:cxn modelId="{31C13A0C-8894-4BA6-9076-947AC3E47BC1}" srcId="{3E7FC8A0-0A09-4769-9A8D-ACDE06C6FB1D}" destId="{4DD8320B-72A3-4376-937B-1312ABE3D389}" srcOrd="0" destOrd="0" parTransId="{7CAF6B4D-78FE-441C-B541-9F8F4569118D}" sibTransId="{805B2A44-BA86-428D-AA37-D18BD0E595A1}"/>
-    <dgm:cxn modelId="{DE1E6C0F-6AE4-4C0B-AB3C-86693E54B0CD}" type="presOf" srcId="{831A1F8D-6ECE-47EB-A35F-C3216108ECB2}" destId="{32BB8D11-D35B-4C56-9D73-ECBD62ACBB11}" srcOrd="0" destOrd="0" presId="urn:microsoft.com/office/officeart/2005/8/layout/hierarchy6"/>
-    <dgm:cxn modelId="{8E708819-54DC-4E5D-B49D-966BCF0105D7}" srcId="{DC87C6F7-2230-4616-A048-B52CF746B139}" destId="{3E7FC8A0-0A09-4769-9A8D-ACDE06C6FB1D}" srcOrd="0" destOrd="0" parTransId="{7AAABFDD-135C-49A7-B551-53F32CF5EF27}" sibTransId="{348A8937-DE76-4DB7-AE03-B69CB190C1BC}"/>
+    <dgm:cxn modelId="{299F90DB-DA7E-4999-802A-13763E0C50CD}" type="presOf" srcId="{7AAABFDD-135C-49A7-B551-53F32CF5EF27}" destId="{B441FB95-FAC5-4341-9531-6EE991D19304}" srcOrd="0" destOrd="0" presId="urn:microsoft.com/office/officeart/2005/8/layout/hierarchy6"/>
+    <dgm:cxn modelId="{8A7D5364-9FF9-42B9-80AD-BF8A449ECDD5}" srcId="{0CF50144-2FF4-40C4-9316-30D6C100994A}" destId="{43C52038-84AF-49A2-A6AA-3A9D02B1C9C4}" srcOrd="1" destOrd="0" parTransId="{ACF4D7C5-E61D-40D1-857C-DE53439FC1C3}" sibTransId="{6F6D1DE7-122C-4AAA-AD8E-EED82E65E400}"/>
+    <dgm:cxn modelId="{5049869A-B449-46CF-BF71-45DCFA5F8442}" type="presOf" srcId="{E3EDC961-6E8D-4FA7-ADEF-1EBA9FE42A78}" destId="{26CAE976-1479-4F47-8C45-4AA541B30ACA}" srcOrd="0" destOrd="0" presId="urn:microsoft.com/office/officeart/2005/8/layout/hierarchy6"/>
+    <dgm:cxn modelId="{A536E61D-953A-4E39-A153-1FB12DBC0523}" type="presOf" srcId="{7CAF6B4D-78FE-441C-B541-9F8F4569118D}" destId="{F14626FE-E07A-4414-897B-524D2848A3D9}" srcOrd="0" destOrd="0" presId="urn:microsoft.com/office/officeart/2005/8/layout/hierarchy6"/>
+    <dgm:cxn modelId="{27092BFB-8D31-461B-897C-2DB02D458C05}" srcId="{0CF50144-2FF4-40C4-9316-30D6C100994A}" destId="{831A1F8D-6ECE-47EB-A35F-C3216108ECB2}" srcOrd="0" destOrd="0" parTransId="{B7AA7E8A-A8E7-4385-BC02-322C7D14A4D6}" sibTransId="{8BDF9B90-1679-470A-AB05-5F77FD7E7C20}"/>
+    <dgm:cxn modelId="{D2878C7E-83A4-4A5F-85CF-3F360A07FF27}" type="presOf" srcId="{B7AA7E8A-A8E7-4385-BC02-322C7D14A4D6}" destId="{0562419B-F5A3-4FA6-8622-8162CA041F03}" srcOrd="0" destOrd="0" presId="urn:microsoft.com/office/officeart/2005/8/layout/hierarchy6"/>
     <dgm:cxn modelId="{0498B219-A4B7-4A79-8C47-43A2C936CD36}" type="presOf" srcId="{43C52038-84AF-49A2-A6AA-3A9D02B1C9C4}" destId="{E2DBD94E-B76B-4C03-A995-2549099419F4}" srcOrd="0" destOrd="0" presId="urn:microsoft.com/office/officeart/2005/8/layout/hierarchy6"/>
-    <dgm:cxn modelId="{A536E61D-953A-4E39-A153-1FB12DBC0523}" type="presOf" srcId="{7CAF6B4D-78FE-441C-B541-9F8F4569118D}" destId="{F14626FE-E07A-4414-897B-524D2848A3D9}" srcOrd="0" destOrd="0" presId="urn:microsoft.com/office/officeart/2005/8/layout/hierarchy6"/>
-    <dgm:cxn modelId="{99F70C22-CB14-44BD-A847-8CD60AAB69CD}" type="presOf" srcId="{A4EEFC09-29A6-4AC9-ADD6-6E3D00B689FE}" destId="{D640BE23-B8E5-4937-A364-140053DD9DA0}" srcOrd="0" destOrd="0" presId="urn:microsoft.com/office/officeart/2005/8/layout/hierarchy6"/>
-    <dgm:cxn modelId="{8A7D5364-9FF9-42B9-80AD-BF8A449ECDD5}" srcId="{0CF50144-2FF4-40C4-9316-30D6C100994A}" destId="{43C52038-84AF-49A2-A6AA-3A9D02B1C9C4}" srcOrd="1" destOrd="0" parTransId="{ACF4D7C5-E61D-40D1-857C-DE53439FC1C3}" sibTransId="{6F6D1DE7-122C-4AAA-AD8E-EED82E65E400}"/>
-    <dgm:cxn modelId="{31DD5D6C-DD02-435A-BCDF-1C4650DD5673}" type="presOf" srcId="{0CF50144-2FF4-40C4-9316-30D6C100994A}" destId="{6C91BB51-8AD0-45C1-8B0F-C24C897FB0E9}" srcOrd="0" destOrd="0" presId="urn:microsoft.com/office/officeart/2005/8/layout/hierarchy6"/>
     <dgm:cxn modelId="{7F2C234F-6E1E-48BF-BE58-EA670DDA5565}" srcId="{A4EEFC09-29A6-4AC9-ADD6-6E3D00B689FE}" destId="{0CF50144-2FF4-40C4-9316-30D6C100994A}" srcOrd="0" destOrd="0" parTransId="{338DD030-9382-4C21-965C-562BCBBF31B6}" sibTransId="{1C7C3DBA-E1DA-4F93-9866-326025D6839F}"/>
-    <dgm:cxn modelId="{E1B56650-C459-427B-9DFC-495ACAFE7008}" type="presOf" srcId="{928BC48A-0622-4B0F-87BA-5C2E3F92BFA8}" destId="{91278B1F-8C76-44BE-8617-567D87E5D98A}" srcOrd="0" destOrd="0" presId="urn:microsoft.com/office/officeart/2005/8/layout/hierarchy6"/>
-    <dgm:cxn modelId="{D2878C7E-83A4-4A5F-85CF-3F360A07FF27}" type="presOf" srcId="{B7AA7E8A-A8E7-4385-BC02-322C7D14A4D6}" destId="{0562419B-F5A3-4FA6-8622-8162CA041F03}" srcOrd="0" destOrd="0" presId="urn:microsoft.com/office/officeart/2005/8/layout/hierarchy6"/>
-    <dgm:cxn modelId="{20D0F089-DF93-4C3D-AA58-973644F8B452}" srcId="{831A1F8D-6ECE-47EB-A35F-C3216108ECB2}" destId="{315E5632-9778-42FD-B65A-9F376649F93B}" srcOrd="1" destOrd="0" parTransId="{928BC48A-0622-4B0F-87BA-5C2E3F92BFA8}" sibTransId="{1F26003D-A9C6-4588-BD6D-4B4FB4422A8C}"/>
-    <dgm:cxn modelId="{48A71695-3FF7-4EE3-A651-6CCA9B586465}" type="presOf" srcId="{ACF4D7C5-E61D-40D1-857C-DE53439FC1C3}" destId="{9BF356A3-130D-49F0-ACC3-4EEB54B01D4B}" srcOrd="0" destOrd="0" presId="urn:microsoft.com/office/officeart/2005/8/layout/hierarchy6"/>
-    <dgm:cxn modelId="{5049869A-B449-46CF-BF71-45DCFA5F8442}" type="presOf" srcId="{E3EDC961-6E8D-4FA7-ADEF-1EBA9FE42A78}" destId="{26CAE976-1479-4F47-8C45-4AA541B30ACA}" srcOrd="0" destOrd="0" presId="urn:microsoft.com/office/officeart/2005/8/layout/hierarchy6"/>
-    <dgm:cxn modelId="{6A8B90A6-E750-4EDD-B3EE-B7FD694DF2BF}" srcId="{9E1B371D-F429-4C1A-9057-85DC424AB51B}" destId="{A4EEFC09-29A6-4AC9-ADD6-6E3D00B689FE}" srcOrd="0" destOrd="0" parTransId="{E292016E-A8B3-4161-BE3A-BC1D6B7A3C9F}" sibTransId="{9B43239C-99E6-4440-83C6-2206D2524D4F}"/>
-    <dgm:cxn modelId="{7FD6BCB0-2A88-4BDF-8B9E-AED86D64FD49}" type="presOf" srcId="{4DD8320B-72A3-4376-937B-1312ABE3D389}" destId="{B8D195D4-2F3F-4033-88EF-FAAA2C4574AB}" srcOrd="0" destOrd="0" presId="urn:microsoft.com/office/officeart/2005/8/layout/hierarchy6"/>
-    <dgm:cxn modelId="{CFCE7CB3-F1F0-4727-AE54-06A085F7E8CA}" srcId="{831A1F8D-6ECE-47EB-A35F-C3216108ECB2}" destId="{E3EDC961-6E8D-4FA7-ADEF-1EBA9FE42A78}" srcOrd="0" destOrd="0" parTransId="{BEE919CC-B3F4-4B79-B286-D745FE4D6131}" sibTransId="{C92D9BE3-3FA2-4A79-90B5-CCBC5D292E90}"/>
-    <dgm:cxn modelId="{992808B9-4256-4FEB-A303-99E48DC2BCE7}" type="presOf" srcId="{DC87C6F7-2230-4616-A048-B52CF746B139}" destId="{027F0FDB-893C-4ACE-A280-DB8972739F7A}" srcOrd="0" destOrd="0" presId="urn:microsoft.com/office/officeart/2005/8/layout/hierarchy6"/>
-    <dgm:cxn modelId="{04454BBC-AA90-4127-93FE-D07929768187}" srcId="{A4EEFC09-29A6-4AC9-ADD6-6E3D00B689FE}" destId="{DC87C6F7-2230-4616-A048-B52CF746B139}" srcOrd="1" destOrd="0" parTransId="{B5D13530-A86C-4AE9-AA52-B5AE819C75F8}" sibTransId="{380E520D-076D-4816-901E-3434A1B7611E}"/>
     <dgm:cxn modelId="{1D9F8CC3-0AF2-4FA4-B3AD-A3B343DA5393}" type="presOf" srcId="{9E1B371D-F429-4C1A-9057-85DC424AB51B}" destId="{9E07B628-3275-4939-9BEC-B21FC9FEF2D1}" srcOrd="0" destOrd="0" presId="urn:microsoft.com/office/officeart/2005/8/layout/hierarchy6"/>
-    <dgm:cxn modelId="{CE458EC7-03AB-4C64-A13D-B401A8E6059D}" type="presOf" srcId="{338DD030-9382-4C21-965C-562BCBBF31B6}" destId="{21176C0B-04F4-4443-8A1A-108B7D8E57A3}" srcOrd="0" destOrd="0" presId="urn:microsoft.com/office/officeart/2005/8/layout/hierarchy6"/>
     <dgm:cxn modelId="{C82B12CD-5AD3-4DA3-9071-ECCF34E25E0F}" type="presOf" srcId="{315E5632-9778-42FD-B65A-9F376649F93B}" destId="{DB315337-C2F8-4A95-8AC6-3FC96AE3D762}" srcOrd="0" destOrd="0" presId="urn:microsoft.com/office/officeart/2005/8/layout/hierarchy6"/>
-    <dgm:cxn modelId="{AEEFC1D1-6BA4-40A2-B8F6-978A97450798}" type="presOf" srcId="{B5D13530-A86C-4AE9-AA52-B5AE819C75F8}" destId="{603A8723-F6F5-4F87-82C3-B792E1F96C9D}" srcOrd="0" destOrd="0" presId="urn:microsoft.com/office/officeart/2005/8/layout/hierarchy6"/>
-    <dgm:cxn modelId="{16C5F3D3-BE64-4D85-9D91-63233FD458D0}" type="presOf" srcId="{BEE919CC-B3F4-4B79-B286-D745FE4D6131}" destId="{A886ECB0-9441-4696-BF52-7A5C777A2814}" srcOrd="0" destOrd="0" presId="urn:microsoft.com/office/officeart/2005/8/layout/hierarchy6"/>
-    <dgm:cxn modelId="{299F90DB-DA7E-4999-802A-13763E0C50CD}" type="presOf" srcId="{7AAABFDD-135C-49A7-B551-53F32CF5EF27}" destId="{B441FB95-FAC5-4341-9531-6EE991D19304}" srcOrd="0" destOrd="0" presId="urn:microsoft.com/office/officeart/2005/8/layout/hierarchy6"/>
-    <dgm:cxn modelId="{D40F07DF-E9C0-48B1-AB1A-AE943E30A99A}" type="presOf" srcId="{3E7FC8A0-0A09-4769-9A8D-ACDE06C6FB1D}" destId="{0946F033-8450-4E70-9B4B-334353E0F312}" srcOrd="0" destOrd="0" presId="urn:microsoft.com/office/officeart/2005/8/layout/hierarchy6"/>
-    <dgm:cxn modelId="{27092BFB-8D31-461B-897C-2DB02D458C05}" srcId="{0CF50144-2FF4-40C4-9316-30D6C100994A}" destId="{831A1F8D-6ECE-47EB-A35F-C3216108ECB2}" srcOrd="0" destOrd="0" parTransId="{B7AA7E8A-A8E7-4385-BC02-322C7D14A4D6}" sibTransId="{8BDF9B90-1679-470A-AB05-5F77FD7E7C20}"/>
     <dgm:cxn modelId="{D28F418D-61B8-4D4B-8129-551102A9164D}" type="presParOf" srcId="{9E07B628-3275-4939-9BEC-B21FC9FEF2D1}" destId="{E9C15D92-DC6A-4A1E-8100-5F3AFFA44721}" srcOrd="0" destOrd="0" presId="urn:microsoft.com/office/officeart/2005/8/layout/hierarchy6"/>
     <dgm:cxn modelId="{915993C7-30E6-43AA-90D6-B26885E05A4B}" type="presParOf" srcId="{E9C15D92-DC6A-4A1E-8100-5F3AFFA44721}" destId="{35D58FDD-AADD-4B95-8CCD-E56D9075C5C3}" srcOrd="0" destOrd="0" presId="urn:microsoft.com/office/officeart/2005/8/layout/hierarchy6"/>
     <dgm:cxn modelId="{467656EC-4F9E-4C29-8DD8-F0A595502510}" type="presParOf" srcId="{35D58FDD-AADD-4B95-8CCD-E56D9075C5C3}" destId="{01D8D9AA-D2D0-4D02-81E4-C0D3BAECD017}" srcOrd="0" destOrd="0" presId="urn:microsoft.com/office/officeart/2005/8/layout/hierarchy6"/>
@@ -11719,7 +11794,7 @@
         </a:bodyPr>
         <a:lstStyle/>
         <a:p>
-          <a:pPr marL="0" lvl="0" indent="0" algn="ctr" defTabSz="355600">
+          <a:pPr lvl="0" algn="ctr" defTabSz="355600">
             <a:lnSpc>
               <a:spcPct val="90000"/>
             </a:lnSpc>
@@ -11729,7 +11804,6 @@
             <a:spcAft>
               <a:spcPct val="35000"/>
             </a:spcAft>
-            <a:buNone/>
           </a:pPr>
           <a:r>
             <a:rPr lang="es-CO" sz="800" kern="1200" dirty="0"/>
@@ -11861,7 +11935,7 @@
         </a:bodyPr>
         <a:lstStyle/>
         <a:p>
-          <a:pPr marL="0" lvl="0" indent="0" algn="ctr" defTabSz="355600">
+          <a:pPr lvl="0" algn="ctr" defTabSz="355600">
             <a:lnSpc>
               <a:spcPct val="90000"/>
             </a:lnSpc>
@@ -11871,7 +11945,6 @@
             <a:spcAft>
               <a:spcPct val="35000"/>
             </a:spcAft>
-            <a:buNone/>
           </a:pPr>
           <a:r>
             <a:rPr lang="es-CO" sz="800" kern="1200" dirty="0"/>
@@ -12003,7 +12076,7 @@
         </a:bodyPr>
         <a:lstStyle/>
         <a:p>
-          <a:pPr marL="0" lvl="0" indent="0" algn="ctr" defTabSz="355600">
+          <a:pPr lvl="0" algn="ctr" defTabSz="355600">
             <a:lnSpc>
               <a:spcPct val="90000"/>
             </a:lnSpc>
@@ -12013,7 +12086,6 @@
             <a:spcAft>
               <a:spcPct val="35000"/>
             </a:spcAft>
-            <a:buNone/>
           </a:pPr>
           <a:r>
             <a:rPr lang="es-CO" sz="800" kern="1200" dirty="0"/>
@@ -12145,7 +12217,7 @@
         </a:bodyPr>
         <a:lstStyle/>
         <a:p>
-          <a:pPr marL="0" lvl="0" indent="0" algn="ctr" defTabSz="355600">
+          <a:pPr lvl="0" algn="ctr" defTabSz="355600">
             <a:lnSpc>
               <a:spcPct val="90000"/>
             </a:lnSpc>
@@ -12155,7 +12227,6 @@
             <a:spcAft>
               <a:spcPct val="35000"/>
             </a:spcAft>
-            <a:buNone/>
           </a:pPr>
           <a:r>
             <a:rPr lang="es-CO" sz="800" kern="1200" dirty="0"/>
@@ -12287,7 +12358,7 @@
         </a:bodyPr>
         <a:lstStyle/>
         <a:p>
-          <a:pPr marL="0" lvl="0" indent="0" algn="ctr" defTabSz="355600">
+          <a:pPr lvl="0" algn="ctr" defTabSz="355600">
             <a:lnSpc>
               <a:spcPct val="90000"/>
             </a:lnSpc>
@@ -12297,7 +12368,6 @@
             <a:spcAft>
               <a:spcPct val="35000"/>
             </a:spcAft>
-            <a:buNone/>
           </a:pPr>
           <a:r>
             <a:rPr lang="es-CO" sz="800" kern="1200" dirty="0"/>
@@ -12429,7 +12499,7 @@
         </a:bodyPr>
         <a:lstStyle/>
         <a:p>
-          <a:pPr marL="0" lvl="0" indent="0" algn="ctr" defTabSz="355600">
+          <a:pPr lvl="0" algn="ctr" defTabSz="355600">
             <a:lnSpc>
               <a:spcPct val="90000"/>
             </a:lnSpc>
@@ -12439,7 +12509,6 @@
             <a:spcAft>
               <a:spcPct val="35000"/>
             </a:spcAft>
-            <a:buNone/>
           </a:pPr>
           <a:r>
             <a:rPr lang="es-MX" sz="800" b="1" i="0" u="none" kern="1200" dirty="0"/>
@@ -12572,7 +12641,7 @@
         </a:bodyPr>
         <a:lstStyle/>
         <a:p>
-          <a:pPr marL="0" lvl="0" indent="0" algn="ctr" defTabSz="355600">
+          <a:pPr lvl="0" algn="ctr" defTabSz="355600">
             <a:lnSpc>
               <a:spcPct val="90000"/>
             </a:lnSpc>
@@ -12582,7 +12651,6 @@
             <a:spcAft>
               <a:spcPct val="35000"/>
             </a:spcAft>
-            <a:buNone/>
           </a:pPr>
           <a:r>
             <a:rPr lang="es-MX" sz="800" b="0" i="0" u="none" kern="1200" dirty="0"/>
@@ -12709,7 +12777,7 @@
         </a:bodyPr>
         <a:lstStyle/>
         <a:p>
-          <a:pPr marL="0" lvl="0" indent="0" algn="ctr" defTabSz="355600">
+          <a:pPr lvl="0" algn="ctr" defTabSz="355600">
             <a:lnSpc>
               <a:spcPct val="90000"/>
             </a:lnSpc>
@@ -12719,7 +12787,6 @@
             <a:spcAft>
               <a:spcPct val="35000"/>
             </a:spcAft>
-            <a:buNone/>
           </a:pPr>
           <a:r>
             <a:rPr lang="es-CO" sz="800" kern="1200" dirty="0"/>
@@ -12845,7 +12912,7 @@
         </a:bodyPr>
         <a:lstStyle/>
         <a:p>
-          <a:pPr marL="0" lvl="0" indent="0" algn="ctr" defTabSz="355600">
+          <a:pPr lvl="0" algn="ctr" defTabSz="355600">
             <a:lnSpc>
               <a:spcPct val="90000"/>
             </a:lnSpc>
@@ -12855,7 +12922,6 @@
             <a:spcAft>
               <a:spcPct val="35000"/>
             </a:spcAft>
-            <a:buNone/>
           </a:pPr>
           <a:r>
             <a:rPr lang="es-CO" sz="800" kern="1200" dirty="0"/>
@@ -14418,7 +14484,7 @@
 </file>
 
 <file path=word/glossary/document.xml><?xml version="1.0" encoding="utf-8"?>
-<w:glossaryDocument xmlns:wpc="http://schemas.microsoft.com/office/word/2010/wordprocessingCanvas" xmlns:cx="http://schemas.microsoft.com/office/drawing/2014/chartex" xmlns:cx1="http://schemas.microsoft.com/office/drawing/2015/9/8/chartex" xmlns:cx2="http://schemas.microsoft.com/office/drawing/2015/10/21/chartex" xmlns:cx3="http://schemas.microsoft.com/office/drawing/2016/5/9/chartex" xmlns:cx4="http://schemas.microsoft.com/office/drawing/2016/5/10/chartex" xmlns:cx5="http://schemas.microsoft.com/office/drawing/2016/5/11/chartex" xmlns:cx6="http://schemas.microsoft.com/office/drawing/2016/5/12/chartex" xmlns:cx7="http://schemas.microsoft.com/office/drawing/2016/5/13/chartex" xmlns:cx8="http://schemas.microsoft.com/office/drawing/2016/5/14/chartex" xmlns:mc="http://schemas.openxmlformats.org/markup-compatibility/2006" xmlns:aink="http://schemas.microsoft.com/office/drawing/2016/ink" xmlns:am3d="http://schemas.microsoft.com/office/drawing/2017/model3d" xmlns:o="urn:schemas-microsoft-com:office:office" xmlns:oel="http://schemas.microsoft.com/office/2019/extlst" xmlns:r="http://schemas.openxmlformats.org/officeDocument/2006/relationships" xmlns:m="http://schemas.openxmlformats.org/officeDocument/2006/math" xmlns:v="urn:schemas-microsoft-com:vml" xmlns:wp14="http://schemas.microsoft.com/office/word/2010/wordprocessingDrawing" xmlns:wp="http://schemas.openxmlformats.org/drawingml/2006/wordprocessingDrawing" xmlns:w10="urn:schemas-microsoft-com:office:word" xmlns:w="http://schemas.openxmlformats.org/wordprocessingml/2006/main" xmlns:w14="http://schemas.microsoft.com/office/word/2010/wordml" xmlns:w15="http://schemas.microsoft.com/office/word/2012/wordml" xmlns:w16cex="http://schemas.microsoft.com/office/word/2018/wordml/cex" xmlns:w16cid="http://schemas.microsoft.com/office/word/2016/wordml/cid" xmlns:w16="http://schemas.microsoft.com/office/word/2018/wordml" xmlns:w16du="http://schemas.microsoft.com/office/word/2023/wordml/word16du" xmlns:w16sdtdh="http://schemas.microsoft.com/office/word/2020/wordml/sdtdatahash" xmlns:w16sdtfl="http://schemas.microsoft.com/office/word/2024/wordml/sdtformatlock" xmlns:w16se="http://schemas.microsoft.com/office/word/2015/wordml/symex" xmlns:wpg="http://schemas.microsoft.com/office/word/2010/wordprocessingGroup" xmlns:wpi="http://schemas.microsoft.com/office/word/2010/wordprocessingInk" xmlns:wne="http://schemas.microsoft.com/office/word/2006/wordml" xmlns:wps="http://schemas.microsoft.com/office/word/2010/wordprocessingShape" mc:Ignorable="w14 w15 w16se w16cid w16 w16cex w16sdtdh w16sdtfl w16du wp14">
+<w:glossaryDocument xmlns:wpc="http://schemas.microsoft.com/office/word/2010/wordprocessingCanvas" xmlns:cx="http://schemas.microsoft.com/office/drawing/2014/chartex" xmlns:mc="http://schemas.openxmlformats.org/markup-compatibility/2006" xmlns:o="urn:schemas-microsoft-com:office:office" xmlns:r="http://schemas.openxmlformats.org/officeDocument/2006/relationships" xmlns:m="http://schemas.openxmlformats.org/officeDocument/2006/math" xmlns:v="urn:schemas-microsoft-com:vml" xmlns:wp14="http://schemas.microsoft.com/office/word/2010/wordprocessingDrawing" xmlns:wp="http://schemas.openxmlformats.org/drawingml/2006/wordprocessingDrawing" xmlns:w10="urn:schemas-microsoft-com:office:word" xmlns:w="http://schemas.openxmlformats.org/wordprocessingml/2006/main" xmlns:w14="http://schemas.microsoft.com/office/word/2010/wordml" xmlns:w15="http://schemas.microsoft.com/office/word/2012/wordml" xmlns:w16se="http://schemas.microsoft.com/office/word/2015/wordml/symex" xmlns:wpg="http://schemas.microsoft.com/office/word/2010/wordprocessingGroup" xmlns:wpi="http://schemas.microsoft.com/office/word/2010/wordprocessingInk" xmlns:wne="http://schemas.microsoft.com/office/word/2006/wordml" xmlns:wps="http://schemas.microsoft.com/office/word/2010/wordprocessingShape" mc:Ignorable="w14 w15 w16se wp14">
   <w:docParts>
     <w:docPart>
       <w:docPartPr>
@@ -14570,7 +14636,7 @@
 </file>
 
 <file path=word/glossary/fontTable.xml><?xml version="1.0" encoding="utf-8"?>
-<w:fonts xmlns:mc="http://schemas.openxmlformats.org/markup-compatibility/2006" xmlns:r="http://schemas.openxmlformats.org/officeDocument/2006/relationships" xmlns:w="http://schemas.openxmlformats.org/wordprocessingml/2006/main" xmlns:w14="http://schemas.microsoft.com/office/word/2010/wordml" xmlns:w15="http://schemas.microsoft.com/office/word/2012/wordml" xmlns:w16cex="http://schemas.microsoft.com/office/word/2018/wordml/cex" xmlns:w16cid="http://schemas.microsoft.com/office/word/2016/wordml/cid" xmlns:w16="http://schemas.microsoft.com/office/word/2018/wordml" xmlns:w16du="http://schemas.microsoft.com/office/word/2023/wordml/word16du" xmlns:w16sdtdh="http://schemas.microsoft.com/office/word/2020/wordml/sdtdatahash" xmlns:w16sdtfl="http://schemas.microsoft.com/office/word/2024/wordml/sdtformatlock" xmlns:w16se="http://schemas.microsoft.com/office/word/2015/wordml/symex" mc:Ignorable="w14 w15 w16se w16cid w16 w16cex w16sdtdh w16sdtfl w16du">
+<w:fonts xmlns:mc="http://schemas.openxmlformats.org/markup-compatibility/2006" xmlns:r="http://schemas.openxmlformats.org/officeDocument/2006/relationships" xmlns:w="http://schemas.openxmlformats.org/wordprocessingml/2006/main" xmlns:w14="http://schemas.microsoft.com/office/word/2010/wordml" xmlns:w15="http://schemas.microsoft.com/office/word/2012/wordml" xmlns:w16se="http://schemas.microsoft.com/office/word/2015/wordml/symex" mc:Ignorable="w14 w15 w16se">
   <w:font w:name="Symbol">
     <w:panose1 w:val="05050102010706020507"/>
     <w:charset w:val="02"/>
@@ -14628,10 +14694,11 @@
     <w:sig w:usb0="E4002EFF" w:usb1="C000E47F" w:usb2="00000009" w:usb3="00000000" w:csb0="000001FF" w:csb1="00000000"/>
   </w:font>
   <w:font w:name="Roboto">
+    <w:altName w:val="Times New Roman"/>
     <w:charset w:val="00"/>
     <w:family w:val="auto"/>
     <w:pitch w:val="variable"/>
-    <w:sig w:usb0="E0000AFF" w:usb1="5000217F" w:usb2="00000021" w:usb3="00000000" w:csb0="0000019F" w:csb1="00000000"/>
+    <w:sig w:usb0="00000001" w:usb1="5000217F" w:usb2="00000021" w:usb3="00000000" w:csb0="0000019F" w:csb1="00000000"/>
   </w:font>
   <w:font w:name="Calibri Light">
     <w:panose1 w:val="020F0302020204030204"/>
@@ -14648,23 +14715,11 @@
     <w:pitch w:val="variable"/>
     <w:sig w:usb0="E00002FF" w:usb1="2AC7FDFF" w:usb2="00000016" w:usb3="00000000" w:csb0="0002009F" w:csb1="00000000"/>
   </w:font>
-  <w:font w:name="Aptos">
-    <w:charset w:val="00"/>
-    <w:family w:val="swiss"/>
-    <w:pitch w:val="variable"/>
-    <w:sig w:usb0="20000287" w:usb1="00000003" w:usb2="00000000" w:usb3="00000000" w:csb0="0000019F" w:csb1="00000000"/>
-  </w:font>
-  <w:font w:name="Aptos Display">
-    <w:charset w:val="00"/>
-    <w:family w:val="swiss"/>
-    <w:pitch w:val="variable"/>
-    <w:sig w:usb0="20000287" w:usb1="00000003" w:usb2="00000000" w:usb3="00000000" w:csb0="0000019F" w:csb1="00000000"/>
-  </w:font>
 </w:fonts>
 </file>
 
 <file path=word/glossary/settings.xml><?xml version="1.0" encoding="utf-8"?>
-<w:settings xmlns:mc="http://schemas.openxmlformats.org/markup-compatibility/2006" xmlns:o="urn:schemas-microsoft-com:office:office" xmlns:r="http://schemas.openxmlformats.org/officeDocument/2006/relationships" xmlns:m="http://schemas.openxmlformats.org/officeDocument/2006/math" xmlns:v="urn:schemas-microsoft-com:vml" xmlns:w10="urn:schemas-microsoft-com:office:word" xmlns:w="http://schemas.openxmlformats.org/wordprocessingml/2006/main" xmlns:w14="http://schemas.microsoft.com/office/word/2010/wordml" xmlns:w15="http://schemas.microsoft.com/office/word/2012/wordml" xmlns:w16cex="http://schemas.microsoft.com/office/word/2018/wordml/cex" xmlns:w16cid="http://schemas.microsoft.com/office/word/2016/wordml/cid" xmlns:w16="http://schemas.microsoft.com/office/word/2018/wordml" xmlns:w16du="http://schemas.microsoft.com/office/word/2023/wordml/word16du" xmlns:w16sdtdh="http://schemas.microsoft.com/office/word/2020/wordml/sdtdatahash" xmlns:w16sdtfl="http://schemas.microsoft.com/office/word/2024/wordml/sdtformatlock" xmlns:w16se="http://schemas.microsoft.com/office/word/2015/wordml/symex" xmlns:sl="http://schemas.openxmlformats.org/schemaLibrary/2006/main" mc:Ignorable="w14 w15 w16se w16cid w16 w16cex w16sdtdh w16sdtfl w16du">
+<w:settings xmlns:mc="http://schemas.openxmlformats.org/markup-compatibility/2006" xmlns:o="urn:schemas-microsoft-com:office:office" xmlns:r="http://schemas.openxmlformats.org/officeDocument/2006/relationships" xmlns:m="http://schemas.openxmlformats.org/officeDocument/2006/math" xmlns:v="urn:schemas-microsoft-com:vml" xmlns:w10="urn:schemas-microsoft-com:office:word" xmlns:w="http://schemas.openxmlformats.org/wordprocessingml/2006/main" xmlns:w14="http://schemas.microsoft.com/office/word/2010/wordml" xmlns:w15="http://schemas.microsoft.com/office/word/2012/wordml" xmlns:w16se="http://schemas.microsoft.com/office/word/2015/wordml/symex" xmlns:sl="http://schemas.openxmlformats.org/schemaLibrary/2006/main" mc:Ignorable="w14 w15 w16se">
   <w:view w:val="normal"/>
   <w:defaultTabStop w:val="708"/>
   <w:hyphenationZone w:val="425"/>
@@ -14676,7 +14731,6 @@
     <w:compatSetting w:name="enableOpenTypeFeatures" w:uri="http://schemas.microsoft.com/office/word" w:val="1"/>
     <w:compatSetting w:name="doNotFlipMirrorIndents" w:uri="http://schemas.microsoft.com/office/word" w:val="1"/>
     <w:compatSetting w:name="differentiateMultirowTableHeaders" w:uri="http://schemas.microsoft.com/office/word" w:val="1"/>
-    <w:compatSetting w:name="useWord2013TrackBottomHyphenation" w:uri="http://schemas.microsoft.com/office/word" w:val="0"/>
   </w:compat>
   <w:rsids>
     <w:rsidRoot w:val="0023170B"/>
@@ -14711,6 +14765,7 @@
     <w:rsid w:val="00A54261"/>
     <w:rsid w:val="00A60954"/>
     <w:rsid w:val="00A84A1C"/>
+    <w:rsid w:val="00B74DC7"/>
     <w:rsid w:val="00BD799B"/>
     <w:rsid w:val="00C731F6"/>
     <w:rsid w:val="00CA1603"/>
@@ -14749,7 +14804,7 @@
 </file>
 
 <file path=word/glossary/styles.xml><?xml version="1.0" encoding="utf-8"?>
-<w:styles xmlns:mc="http://schemas.openxmlformats.org/markup-compatibility/2006" xmlns:r="http://schemas.openxmlformats.org/officeDocument/2006/relationships" xmlns:w="http://schemas.openxmlformats.org/wordprocessingml/2006/main" xmlns:w14="http://schemas.microsoft.com/office/word/2010/wordml" xmlns:w15="http://schemas.microsoft.com/office/word/2012/wordml" xmlns:w16cex="http://schemas.microsoft.com/office/word/2018/wordml/cex" xmlns:w16cid="http://schemas.microsoft.com/office/word/2016/wordml/cid" xmlns:w16="http://schemas.microsoft.com/office/word/2018/wordml" xmlns:w16du="http://schemas.microsoft.com/office/word/2023/wordml/word16du" xmlns:w16sdtdh="http://schemas.microsoft.com/office/word/2020/wordml/sdtdatahash" xmlns:w16sdtfl="http://schemas.microsoft.com/office/word/2024/wordml/sdtformatlock" xmlns:w16se="http://schemas.microsoft.com/office/word/2015/wordml/symex" mc:Ignorable="w14 w15 w16se w16cid w16 w16cex w16sdtdh w16sdtfl w16du">
+<w:styles xmlns:mc="http://schemas.openxmlformats.org/markup-compatibility/2006" xmlns:r="http://schemas.openxmlformats.org/officeDocument/2006/relationships" xmlns:w="http://schemas.openxmlformats.org/wordprocessingml/2006/main" xmlns:w14="http://schemas.microsoft.com/office/word/2010/wordml" xmlns:w15="http://schemas.microsoft.com/office/word/2012/wordml" xmlns:w16se="http://schemas.microsoft.com/office/word/2015/wordml/symex" mc:Ignorable="w14 w15 w16se">
   <w:docDefaults>
     <w:rPrDefault>
       <w:rPr>
@@ -14765,7 +14820,7 @@
       </w:pPr>
     </w:pPrDefault>
   </w:docDefaults>
-  <w:latentStyles w:defLockedState="0" w:defUIPriority="99" w:defSemiHidden="0" w:defUnhideWhenUsed="0" w:defQFormat="0" w:count="376">
+  <w:latentStyles w:defLockedState="0" w:defUIPriority="99" w:defSemiHidden="0" w:defUnhideWhenUsed="0" w:defQFormat="0" w:count="371">
     <w:lsdException w:name="Normal" w:uiPriority="0" w:qFormat="1"/>
     <w:lsdException w:name="heading 1" w:uiPriority="9" w:qFormat="1"/>
     <w:lsdException w:name="heading 2" w:semiHidden="1" w:uiPriority="9" w:unhideWhenUsed="1" w:qFormat="1"/>
@@ -15137,11 +15192,6 @@
     <w:lsdException w:name="List Table 5 Dark Accent 6" w:uiPriority="50"/>
     <w:lsdException w:name="List Table 6 Colorful Accent 6" w:uiPriority="51"/>
     <w:lsdException w:name="List Table 7 Colorful Accent 6" w:uiPriority="52"/>
-    <w:lsdException w:name="Mention" w:semiHidden="1" w:unhideWhenUsed="1"/>
-    <w:lsdException w:name="Smart Hyperlink" w:semiHidden="1" w:unhideWhenUsed="1"/>
-    <w:lsdException w:name="Hashtag" w:semiHidden="1" w:unhideWhenUsed="1"/>
-    <w:lsdException w:name="Unresolved Mention" w:semiHidden="1" w:unhideWhenUsed="1"/>
-    <w:lsdException w:name="Smart Link" w:semiHidden="1" w:unhideWhenUsed="1"/>
   </w:latentStyles>
   <w:style w:type="paragraph" w:default="1" w:styleId="Normal">
     <w:name w:val="Normal"/>
@@ -15208,7 +15258,7 @@
 </file>
 
 <file path=word/glossary/webSettings.xml><?xml version="1.0" encoding="utf-8"?>
-<w:webSettings xmlns:mc="http://schemas.openxmlformats.org/markup-compatibility/2006" xmlns:r="http://schemas.openxmlformats.org/officeDocument/2006/relationships" xmlns:w="http://schemas.openxmlformats.org/wordprocessingml/2006/main" xmlns:w14="http://schemas.microsoft.com/office/word/2010/wordml" xmlns:w15="http://schemas.microsoft.com/office/word/2012/wordml" xmlns:w16cex="http://schemas.microsoft.com/office/word/2018/wordml/cex" xmlns:w16cid="http://schemas.microsoft.com/office/word/2016/wordml/cid" xmlns:w16="http://schemas.microsoft.com/office/word/2018/wordml" xmlns:w16du="http://schemas.microsoft.com/office/word/2023/wordml/word16du" xmlns:w16sdtdh="http://schemas.microsoft.com/office/word/2020/wordml/sdtdatahash" xmlns:w16sdtfl="http://schemas.microsoft.com/office/word/2024/wordml/sdtformatlock" xmlns:w16se="http://schemas.microsoft.com/office/word/2015/wordml/symex" mc:Ignorable="w14 w15 w16se w16cid w16 w16cex w16sdtdh w16sdtfl w16du">
+<w:webSettings xmlns:mc="http://schemas.openxmlformats.org/markup-compatibility/2006" xmlns:r="http://schemas.openxmlformats.org/officeDocument/2006/relationships" xmlns:w="http://schemas.openxmlformats.org/wordprocessingml/2006/main" xmlns:w14="http://schemas.microsoft.com/office/word/2010/wordml" xmlns:w15="http://schemas.microsoft.com/office/word/2012/wordml" xmlns:w16se="http://schemas.microsoft.com/office/word/2015/wordml/symex" mc:Ignorable="w14 w15 w16se">
   <w:optimizeForBrowser/>
   <w:allowPNG/>
 </w:webSettings>
@@ -15510,15 +15560,6 @@
 </file>
 
 <file path=customXml/item1.xml><?xml version="1.0" encoding="utf-8"?>
-<?mso-contentType ?>
-<FormTemplates xmlns="http://schemas.microsoft.com/sharepoint/v3/contenttype/forms">
-  <Display>DocumentLibraryForm</Display>
-  <Edit>DocumentLibraryForm</Edit>
-  <New>DocumentLibraryForm</New>
-</FormTemplates>
-</file>
-
-<file path=customXml/item2.xml><?xml version="1.0" encoding="utf-8"?>
 <p:properties xmlns:p="http://schemas.microsoft.com/office/2006/metadata/properties" xmlns:xsi="http://www.w3.org/2001/XMLSchema-instance" xmlns:pc="http://schemas.microsoft.com/office/infopath/2007/PartnerControls">
   <documentManagement>
     <SharedWithUsers xmlns="4cffc96c-6241-4aca-8fd8-70c07860be98">
@@ -15534,6 +15575,15 @@
     <TaxCatchAll xmlns="4cffc96c-6241-4aca-8fd8-70c07860be98" xsi:nil="true"/>
   </documentManagement>
 </p:properties>
+</file>
+
+<file path=customXml/item2.xml><?xml version="1.0" encoding="utf-8"?>
+<?mso-contentType ?>
+<FormTemplates xmlns="http://schemas.microsoft.com/sharepoint/v3/contenttype/forms">
+  <Display>DocumentLibraryForm</Display>
+  <Edit>DocumentLibraryForm</Edit>
+  <New>DocumentLibraryForm</New>
+</FormTemplates>
 </file>
 
 <file path=customXml/item3.xml><?xml version="1.0" encoding="utf-8"?>
@@ -15772,26 +15822,20 @@
 </file>
 
 <file path=customXml/itemProps1.xml><?xml version="1.0" encoding="utf-8"?>
-<ds:datastoreItem xmlns:ds="http://schemas.openxmlformats.org/officeDocument/2006/customXml" ds:itemID="{99CBFD45-C13F-4238-A4AB-E781C4C8F582}">
+<ds:datastoreItem xmlns:ds="http://schemas.openxmlformats.org/officeDocument/2006/customXml" ds:itemID="{92AA7C2A-0BF1-44B4-BF8D-D3A9676B847A}">
   <ds:schemaRefs>
-    <ds:schemaRef ds:uri="http://schemas.microsoft.com/sharepoint/v3/contenttype/forms"/>
+    <ds:schemaRef ds:uri="http://schemas.microsoft.com/office/2006/metadata/properties"/>
+    <ds:schemaRef ds:uri="http://schemas.microsoft.com/office/infopath/2007/PartnerControls"/>
+    <ds:schemaRef ds:uri="4cffc96c-6241-4aca-8fd8-70c07860be98"/>
+    <ds:schemaRef ds:uri="7c8edd70-be74-4973-a1f3-0e5202b97ec1"/>
   </ds:schemaRefs>
 </ds:datastoreItem>
 </file>
 
 <file path=customXml/itemProps2.xml><?xml version="1.0" encoding="utf-8"?>
-<ds:datastoreItem xmlns:ds="http://schemas.openxmlformats.org/officeDocument/2006/customXml" ds:itemID="{92AA7C2A-0BF1-44B4-BF8D-D3A9676B847A}">
+<ds:datastoreItem xmlns:ds="http://schemas.openxmlformats.org/officeDocument/2006/customXml" ds:itemID="{99CBFD45-C13F-4238-A4AB-E781C4C8F582}">
   <ds:schemaRefs>
-    <ds:schemaRef ds:uri="http://purl.org/dc/terms/"/>
-    <ds:schemaRef ds:uri="7c8edd70-be74-4973-a1f3-0e5202b97ec1"/>
-    <ds:schemaRef ds:uri="http://schemas.microsoft.com/office/2006/documentManagement/types"/>
-    <ds:schemaRef ds:uri="http://www.w3.org/XML/1998/namespace"/>
-    <ds:schemaRef ds:uri="http://purl.org/dc/elements/1.1/"/>
-    <ds:schemaRef ds:uri="http://schemas.microsoft.com/office/2006/metadata/properties"/>
-    <ds:schemaRef ds:uri="http://schemas.microsoft.com/office/infopath/2007/PartnerControls"/>
-    <ds:schemaRef ds:uri="http://schemas.openxmlformats.org/package/2006/metadata/core-properties"/>
-    <ds:schemaRef ds:uri="4cffc96c-6241-4aca-8fd8-70c07860be98"/>
-    <ds:schemaRef ds:uri="http://purl.org/dc/dcmitype/"/>
+    <ds:schemaRef ds:uri="http://schemas.microsoft.com/sharepoint/v3/contenttype/forms"/>
   </ds:schemaRefs>
 </ds:datastoreItem>
 </file>

</xml_diff>